<commit_message>
Add total contract cost to objection letter
Co-Authored-By: Claude Opus 5.5 <noreply@anthropic.com>
Claude-Session: https://claude.ai/code/session_01MXDAyRkZCZe1vQqjdWh53W
</commit_message>
<xml_diff>
--- a/out/Письмо_заказчику_возражения_по_КП.docx
+++ b/out/Письмо_заказчику_возражения_по_КП.docx
@@ -2648,6 +2648,278 @@
     </w:p>
     <w:p>
       <w:pPr>
+        <w:jc w:val="both"/>
+      </w:pPr>
+      <w:r>
+        <w:rPr>
+          <w:b/>
+        </w:rPr>
+        <w:t>Итоговая стоимость работ с учётом наших возражений — 18 842 308,30 ₽</w:t>
+      </w:r>
+      <w:r>
+        <w:rPr>
+          <w:b w:val="0"/>
+        </w:rPr>
+        <w:t>, с дымоудалением — 19 870 788,30 ₽.</w:t>
+      </w:r>
+    </w:p>
+    <w:tbl>
+      <w:tblPr>
+        <w:tblStyle w:val="TableGrid"/>
+        <w:tblW w:type="auto" w:w="0"/>
+        <w:jc w:val="center"/>
+        <w:tblLayout w:type="fixed"/>
+        <w:tblLook w:firstColumn="1" w:firstRow="1" w:lastColumn="0" w:lastRow="0" w:noHBand="0" w:noVBand="1" w:val="04A0"/>
+      </w:tblPr>
+      <w:tblGrid>
+        <w:gridCol w:w="7087"/>
+        <w:gridCol w:w="2268"/>
+      </w:tblGrid>
+      <w:tr>
+        <w:tc>
+          <w:tcPr>
+            <w:tcW w:type="dxa" w:w="7087"/>
+            <w:shd w:val="clear" w:color="auto" w:fill="D9E1F2"/>
+          </w:tcPr>
+          <w:p>
+            <w:pPr>
+              <w:jc w:val="center"/>
+            </w:pPr>
+            <w:r/>
+            <w:r>
+              <w:rPr>
+                <w:b/>
+                <w:sz w:val="20"/>
+              </w:rPr>
+              <w:t>Состав</w:t>
+            </w:r>
+          </w:p>
+        </w:tc>
+        <w:tc>
+          <w:tcPr>
+            <w:tcW w:type="dxa" w:w="2268"/>
+            <w:shd w:val="clear" w:color="auto" w:fill="D9E1F2"/>
+          </w:tcPr>
+          <w:p>
+            <w:pPr>
+              <w:jc w:val="center"/>
+            </w:pPr>
+            <w:r/>
+            <w:r>
+              <w:rPr>
+                <w:b/>
+                <w:sz w:val="20"/>
+              </w:rPr>
+              <w:t>Сумма, ₽</w:t>
+            </w:r>
+          </w:p>
+        </w:tc>
+      </w:tr>
+      <w:tr>
+        <w:tc>
+          <w:tcPr>
+            <w:tcW w:type="dxa" w:w="7087"/>
+          </w:tcPr>
+          <w:p>
+            <w:pPr>
+              <w:spacing w:after="0"/>
+            </w:pPr>
+            <w:r>
+              <w:rPr>
+                <w:b w:val="0"/>
+                <w:sz w:val="20"/>
+              </w:rPr>
+              <w:t>Работы по ДС № 1 (3, 7–9 этажи) в объёмах КП</w:t>
+            </w:r>
+          </w:p>
+        </w:tc>
+        <w:tc>
+          <w:tcPr>
+            <w:tcW w:type="dxa" w:w="2268"/>
+          </w:tcPr>
+          <w:p>
+            <w:pPr>
+              <w:spacing w:after="0"/>
+              <w:jc w:val="right"/>
+            </w:pPr>
+            <w:r>
+              <w:rPr>
+                <w:b w:val="0"/>
+                <w:sz w:val="20"/>
+              </w:rPr>
+              <w:t>12 728 298,94</w:t>
+            </w:r>
+          </w:p>
+        </w:tc>
+      </w:tr>
+      <w:tr>
+        <w:tc>
+          <w:tcPr>
+            <w:tcW w:type="dxa" w:w="7087"/>
+          </w:tcPr>
+          <w:p>
+            <w:pPr>
+              <w:spacing w:after="0"/>
+            </w:pPr>
+            <w:r>
+              <w:rPr>
+                <w:b w:val="0"/>
+                <w:sz w:val="20"/>
+              </w:rPr>
+              <w:t>Новые работы (10 и 2 этажи, дополнительные работы) — в ДС № 2</w:t>
+            </w:r>
+          </w:p>
+        </w:tc>
+        <w:tc>
+          <w:tcPr>
+            <w:tcW w:type="dxa" w:w="2268"/>
+          </w:tcPr>
+          <w:p>
+            <w:pPr>
+              <w:spacing w:after="0"/>
+              <w:jc w:val="right"/>
+            </w:pPr>
+            <w:r>
+              <w:rPr>
+                <w:b w:val="0"/>
+                <w:sz w:val="20"/>
+              </w:rPr>
+              <w:t>6 114 009,36</w:t>
+            </w:r>
+          </w:p>
+        </w:tc>
+      </w:tr>
+      <w:tr>
+        <w:tc>
+          <w:tcPr>
+            <w:tcW w:type="dxa" w:w="7087"/>
+          </w:tcPr>
+          <w:p>
+            <w:pPr>
+              <w:spacing w:after="0"/>
+            </w:pPr>
+            <w:r>
+              <w:rPr>
+                <w:b/>
+                <w:sz w:val="20"/>
+              </w:rPr>
+              <w:t>Итого по КП</w:t>
+            </w:r>
+          </w:p>
+        </w:tc>
+        <w:tc>
+          <w:tcPr>
+            <w:tcW w:type="dxa" w:w="2268"/>
+          </w:tcPr>
+          <w:p>
+            <w:pPr>
+              <w:spacing w:after="0"/>
+              <w:jc w:val="right"/>
+            </w:pPr>
+            <w:r>
+              <w:rPr>
+                <w:b/>
+                <w:sz w:val="20"/>
+              </w:rPr>
+              <w:t>18 842 308,30</w:t>
+            </w:r>
+          </w:p>
+        </w:tc>
+      </w:tr>
+      <w:tr>
+        <w:tc>
+          <w:tcPr>
+            <w:tcW w:type="dxa" w:w="7087"/>
+          </w:tcPr>
+          <w:p>
+            <w:pPr>
+              <w:spacing w:after="0"/>
+            </w:pPr>
+            <w:r>
+              <w:rPr>
+                <w:b w:val="0"/>
+                <w:sz w:val="20"/>
+              </w:rPr>
+              <w:t>Дымоудаление (10 и 2 этажи) — отдельное допсоглашение</w:t>
+            </w:r>
+          </w:p>
+        </w:tc>
+        <w:tc>
+          <w:tcPr>
+            <w:tcW w:type="dxa" w:w="2268"/>
+          </w:tcPr>
+          <w:p>
+            <w:pPr>
+              <w:spacing w:after="0"/>
+              <w:jc w:val="right"/>
+            </w:pPr>
+            <w:r>
+              <w:rPr>
+                <w:b w:val="0"/>
+                <w:sz w:val="20"/>
+              </w:rPr>
+              <w:t>1 028 480,00</w:t>
+            </w:r>
+          </w:p>
+        </w:tc>
+      </w:tr>
+      <w:tr>
+        <w:tc>
+          <w:tcPr>
+            <w:tcW w:type="dxa" w:w="7087"/>
+          </w:tcPr>
+          <w:p>
+            <w:pPr>
+              <w:spacing w:after="0"/>
+            </w:pPr>
+            <w:r>
+              <w:rPr>
+                <w:b/>
+                <w:sz w:val="20"/>
+              </w:rPr>
+              <w:t>Всего с дымоудалением</w:t>
+            </w:r>
+          </w:p>
+        </w:tc>
+        <w:tc>
+          <w:tcPr>
+            <w:tcW w:type="dxa" w:w="2268"/>
+          </w:tcPr>
+          <w:p>
+            <w:pPr>
+              <w:spacing w:after="0"/>
+              <w:jc w:val="right"/>
+            </w:pPr>
+            <w:r>
+              <w:rPr>
+                <w:b/>
+                <w:sz w:val="20"/>
+              </w:rPr>
+              <w:t>19 870 788,30</w:t>
+            </w:r>
+          </w:p>
+        </w:tc>
+      </w:tr>
+    </w:tbl>
+    <w:p>
+      <w:pPr>
+        <w:spacing w:after="0"/>
+      </w:pPr>
+    </w:p>
+    <w:p>
+      <w:pPr>
+        <w:ind w:firstLine="709"/>
+        <w:jc w:val="both"/>
+      </w:pPr>
+      <w:r>
+        <w:rPr>
+          <w:b w:val="0"/>
+        </w:rPr>
+        <w:t>Для сравнения: Ваша редакция КП с учётом всех комментариев — 16 074 197,14 ₽, разница — 2 768 111,16 ₽. Исходное КП — 22 665 254,14 ₽.</w:t>
+      </w:r>
+    </w:p>
+    <w:p>
+      <w:pPr>
         <w:keepNext/>
         <w:ind w:firstLine="709"/>
         <w:jc w:val="both"/>

</xml_diff>

<commit_message>
Add fan coil, insulation and extra-works objections to customer letter
Co-Authored-By: Claude Opus 5.5 <noreply@anthropic.com>
Claude-Session: https://claude.ai/code/session_01MXDAyRkZCZe1vQqjdWh53W
</commit_message>
<xml_diff>
--- a/out/Письмо_заказчику_возражения_по_КП.docx
+++ b/out/Письмо_заказчику_возражения_по_КП.docx
@@ -105,7 +105,7 @@
         <w:rPr>
           <w:b w:val="0"/>
         </w:rPr>
-        <w:t>Большую часть корректировок мы принимаем, в том числе снижение цен по п. 2.9, 2.10, 2.37, 2.38 до уровня ДС № 1. Однако по ряду позиций просим пересмотреть решение. Ниже — позиции и наши обоснования. Суммы указаны без НДС (Подрядчик применяет УСН).</w:t>
+        <w:t>Часть корректировок мы принимаем, в том числе снижение цен по п. 2.9, 2.10, 2.37, 2.38 до уровня ДС № 1. Однако по ряду позиций просим пересмотреть решение. Ниже — позиции и наши обоснования. Суммы указаны без НДС (Подрядчик применяет УСН).</w:t>
       </w:r>
     </w:p>
     <w:p>
@@ -123,6 +123,7 @@
     </w:p>
     <w:p>
       <w:pPr>
+        <w:keepNext/>
         <w:ind w:firstLine="709"/>
         <w:jc w:val="both"/>
       </w:pPr>
@@ -150,6 +151,9 @@
         <w:gridCol w:w="1587"/>
       </w:tblGrid>
       <w:tr>
+        <w:trPr>
+          <w:cantSplit/>
+        </w:trPr>
         <w:tc>
           <w:tcPr>
             <w:tcW w:type="dxa" w:w="850"/>
@@ -157,6 +161,7 @@
           </w:tcPr>
           <w:p>
             <w:pPr>
+              <w:keepNext/>
               <w:jc w:val="center"/>
             </w:pPr>
             <w:r/>
@@ -176,6 +181,7 @@
           </w:tcPr>
           <w:p>
             <w:pPr>
+              <w:keepNext/>
               <w:jc w:val="center"/>
             </w:pPr>
             <w:r/>
@@ -195,6 +201,7 @@
           </w:tcPr>
           <w:p>
             <w:pPr>
+              <w:keepNext/>
               <w:jc w:val="center"/>
             </w:pPr>
             <w:r/>
@@ -214,6 +221,7 @@
           </w:tcPr>
           <w:p>
             <w:pPr>
+              <w:keepNext/>
               <w:jc w:val="center"/>
             </w:pPr>
             <w:r/>
@@ -233,6 +241,7 @@
           </w:tcPr>
           <w:p>
             <w:pPr>
+              <w:keepNext/>
               <w:jc w:val="center"/>
             </w:pPr>
             <w:r/>
@@ -252,6 +261,7 @@
           </w:tcPr>
           <w:p>
             <w:pPr>
+              <w:keepNext/>
               <w:jc w:val="center"/>
             </w:pPr>
             <w:r/>
@@ -266,12 +276,16 @@
         </w:tc>
       </w:tr>
       <w:tr>
+        <w:trPr>
+          <w:cantSplit/>
+        </w:trPr>
         <w:tc>
           <w:tcPr>
             <w:tcW w:type="dxa" w:w="850"/>
           </w:tcPr>
           <w:p>
             <w:pPr>
+              <w:keepNext/>
               <w:spacing w:after="0"/>
             </w:pPr>
             <w:r>
@@ -289,6 +303,7 @@
           </w:tcPr>
           <w:p>
             <w:pPr>
+              <w:keepNext/>
               <w:spacing w:after="0"/>
             </w:pPr>
             <w:r>
@@ -306,6 +321,7 @@
           </w:tcPr>
           <w:p>
             <w:pPr>
+              <w:keepNext/>
               <w:spacing w:after="0"/>
               <w:jc w:val="right"/>
             </w:pPr>
@@ -324,6 +340,7 @@
           </w:tcPr>
           <w:p>
             <w:pPr>
+              <w:keepNext/>
               <w:spacing w:after="0"/>
               <w:jc w:val="right"/>
             </w:pPr>
@@ -342,6 +359,7 @@
           </w:tcPr>
           <w:p>
             <w:pPr>
+              <w:keepNext/>
               <w:spacing w:after="0"/>
               <w:jc w:val="right"/>
             </w:pPr>
@@ -360,6 +378,7 @@
           </w:tcPr>
           <w:p>
             <w:pPr>
+              <w:keepNext/>
               <w:spacing w:after="0"/>
               <w:jc w:val="right"/>
             </w:pPr>
@@ -374,12 +393,16 @@
         </w:tc>
       </w:tr>
       <w:tr>
+        <w:trPr>
+          <w:cantSplit/>
+        </w:trPr>
         <w:tc>
           <w:tcPr>
             <w:tcW w:type="dxa" w:w="850"/>
           </w:tcPr>
           <w:p>
             <w:pPr>
+              <w:keepNext/>
               <w:spacing w:after="0"/>
             </w:pPr>
             <w:r>
@@ -397,6 +420,7 @@
           </w:tcPr>
           <w:p>
             <w:pPr>
+              <w:keepNext/>
               <w:spacing w:after="0"/>
             </w:pPr>
             <w:r>
@@ -414,6 +438,7 @@
           </w:tcPr>
           <w:p>
             <w:pPr>
+              <w:keepNext/>
               <w:spacing w:after="0"/>
               <w:jc w:val="right"/>
             </w:pPr>
@@ -432,6 +457,7 @@
           </w:tcPr>
           <w:p>
             <w:pPr>
+              <w:keepNext/>
               <w:spacing w:after="0"/>
               <w:jc w:val="right"/>
             </w:pPr>
@@ -450,6 +476,7 @@
           </w:tcPr>
           <w:p>
             <w:pPr>
+              <w:keepNext/>
               <w:spacing w:after="0"/>
               <w:jc w:val="right"/>
             </w:pPr>
@@ -468,6 +495,7 @@
           </w:tcPr>
           <w:p>
             <w:pPr>
+              <w:keepNext/>
               <w:spacing w:after="0"/>
               <w:jc w:val="right"/>
             </w:pPr>
@@ -482,6 +510,9 @@
         </w:tc>
       </w:tr>
       <w:tr>
+        <w:trPr>
+          <w:cantSplit/>
+        </w:trPr>
         <w:tc>
           <w:tcPr>
             <w:tcW w:type="dxa" w:w="850"/>
@@ -672,6 +703,7 @@
     </w:p>
     <w:p>
       <w:pPr>
+        <w:keepNext/>
         <w:ind w:firstLine="709"/>
         <w:jc w:val="both"/>
       </w:pPr>
@@ -698,6 +730,9 @@
         <w:gridCol w:w="1361"/>
       </w:tblGrid>
       <w:tr>
+        <w:trPr>
+          <w:cantSplit/>
+        </w:trPr>
         <w:tc>
           <w:tcPr>
             <w:tcW w:type="dxa" w:w="850"/>
@@ -705,6 +740,7 @@
           </w:tcPr>
           <w:p>
             <w:pPr>
+              <w:keepNext/>
               <w:jc w:val="center"/>
             </w:pPr>
             <w:r/>
@@ -724,6 +760,7 @@
           </w:tcPr>
           <w:p>
             <w:pPr>
+              <w:keepNext/>
               <w:jc w:val="center"/>
             </w:pPr>
             <w:r/>
@@ -743,6 +780,7 @@
           </w:tcPr>
           <w:p>
             <w:pPr>
+              <w:keepNext/>
               <w:jc w:val="center"/>
             </w:pPr>
             <w:r/>
@@ -762,6 +800,7 @@
           </w:tcPr>
           <w:p>
             <w:pPr>
+              <w:keepNext/>
               <w:jc w:val="center"/>
             </w:pPr>
             <w:r/>
@@ -781,6 +820,7 @@
           </w:tcPr>
           <w:p>
             <w:pPr>
+              <w:keepNext/>
               <w:jc w:val="center"/>
             </w:pPr>
             <w:r/>
@@ -795,12 +835,16 @@
         </w:tc>
       </w:tr>
       <w:tr>
+        <w:trPr>
+          <w:cantSplit/>
+        </w:trPr>
         <w:tc>
           <w:tcPr>
             <w:tcW w:type="dxa" w:w="850"/>
           </w:tcPr>
           <w:p>
             <w:pPr>
+              <w:keepNext/>
               <w:spacing w:after="0"/>
             </w:pPr>
             <w:r>
@@ -818,6 +862,7 @@
           </w:tcPr>
           <w:p>
             <w:pPr>
+              <w:keepNext/>
               <w:spacing w:after="0"/>
             </w:pPr>
             <w:r>
@@ -835,6 +880,7 @@
           </w:tcPr>
           <w:p>
             <w:pPr>
+              <w:keepNext/>
               <w:spacing w:after="0"/>
             </w:pPr>
             <w:r>
@@ -852,6 +898,7 @@
           </w:tcPr>
           <w:p>
             <w:pPr>
+              <w:keepNext/>
               <w:spacing w:after="0"/>
               <w:jc w:val="right"/>
             </w:pPr>
@@ -870,6 +917,7 @@
           </w:tcPr>
           <w:p>
             <w:pPr>
+              <w:keepNext/>
               <w:spacing w:after="0"/>
               <w:jc w:val="right"/>
             </w:pPr>
@@ -884,12 +932,16 @@
         </w:tc>
       </w:tr>
       <w:tr>
+        <w:trPr>
+          <w:cantSplit/>
+        </w:trPr>
         <w:tc>
           <w:tcPr>
             <w:tcW w:type="dxa" w:w="850"/>
           </w:tcPr>
           <w:p>
             <w:pPr>
+              <w:keepNext/>
               <w:spacing w:after="0"/>
             </w:pPr>
             <w:r>
@@ -907,6 +959,7 @@
           </w:tcPr>
           <w:p>
             <w:pPr>
+              <w:keepNext/>
               <w:spacing w:after="0"/>
             </w:pPr>
             <w:r>
@@ -924,6 +977,7 @@
           </w:tcPr>
           <w:p>
             <w:pPr>
+              <w:keepNext/>
               <w:spacing w:after="0"/>
             </w:pPr>
             <w:r>
@@ -941,6 +995,7 @@
           </w:tcPr>
           <w:p>
             <w:pPr>
+              <w:keepNext/>
               <w:spacing w:after="0"/>
               <w:jc w:val="right"/>
             </w:pPr>
@@ -959,6 +1014,7 @@
           </w:tcPr>
           <w:p>
             <w:pPr>
+              <w:keepNext/>
               <w:spacing w:after="0"/>
               <w:jc w:val="right"/>
             </w:pPr>
@@ -973,12 +1029,16 @@
         </w:tc>
       </w:tr>
       <w:tr>
+        <w:trPr>
+          <w:cantSplit/>
+        </w:trPr>
         <w:tc>
           <w:tcPr>
             <w:tcW w:type="dxa" w:w="850"/>
           </w:tcPr>
           <w:p>
             <w:pPr>
+              <w:keepNext/>
               <w:spacing w:after="0"/>
             </w:pPr>
             <w:r>
@@ -996,6 +1056,7 @@
           </w:tcPr>
           <w:p>
             <w:pPr>
+              <w:keepNext/>
               <w:spacing w:after="0"/>
             </w:pPr>
             <w:r>
@@ -1013,6 +1074,7 @@
           </w:tcPr>
           <w:p>
             <w:pPr>
+              <w:keepNext/>
               <w:spacing w:after="0"/>
             </w:pPr>
             <w:r>
@@ -1030,6 +1092,7 @@
           </w:tcPr>
           <w:p>
             <w:pPr>
+              <w:keepNext/>
               <w:spacing w:after="0"/>
               <w:jc w:val="right"/>
             </w:pPr>
@@ -1048,6 +1111,7 @@
           </w:tcPr>
           <w:p>
             <w:pPr>
+              <w:keepNext/>
               <w:spacing w:after="0"/>
               <w:jc w:val="right"/>
             </w:pPr>
@@ -1062,12 +1126,16 @@
         </w:tc>
       </w:tr>
       <w:tr>
+        <w:trPr>
+          <w:cantSplit/>
+        </w:trPr>
         <w:tc>
           <w:tcPr>
             <w:tcW w:type="dxa" w:w="850"/>
           </w:tcPr>
           <w:p>
             <w:pPr>
+              <w:keepNext/>
               <w:spacing w:after="0"/>
             </w:pPr>
             <w:r>
@@ -1085,6 +1153,7 @@
           </w:tcPr>
           <w:p>
             <w:pPr>
+              <w:keepNext/>
               <w:spacing w:after="0"/>
             </w:pPr>
             <w:r>
@@ -1102,6 +1171,7 @@
           </w:tcPr>
           <w:p>
             <w:pPr>
+              <w:keepNext/>
               <w:spacing w:after="0"/>
             </w:pPr>
             <w:r>
@@ -1119,6 +1189,7 @@
           </w:tcPr>
           <w:p>
             <w:pPr>
+              <w:keepNext/>
               <w:spacing w:after="0"/>
               <w:jc w:val="right"/>
             </w:pPr>
@@ -1137,6 +1208,7 @@
           </w:tcPr>
           <w:p>
             <w:pPr>
+              <w:keepNext/>
               <w:spacing w:after="0"/>
               <w:jc w:val="right"/>
             </w:pPr>
@@ -1151,12 +1223,16 @@
         </w:tc>
       </w:tr>
       <w:tr>
+        <w:trPr>
+          <w:cantSplit/>
+        </w:trPr>
         <w:tc>
           <w:tcPr>
             <w:tcW w:type="dxa" w:w="850"/>
           </w:tcPr>
           <w:p>
             <w:pPr>
+              <w:keepNext/>
               <w:spacing w:after="0"/>
             </w:pPr>
             <w:r>
@@ -1174,6 +1250,7 @@
           </w:tcPr>
           <w:p>
             <w:pPr>
+              <w:keepNext/>
               <w:spacing w:after="0"/>
             </w:pPr>
             <w:r>
@@ -1191,6 +1268,7 @@
           </w:tcPr>
           <w:p>
             <w:pPr>
+              <w:keepNext/>
               <w:spacing w:after="0"/>
             </w:pPr>
             <w:r>
@@ -1208,6 +1286,7 @@
           </w:tcPr>
           <w:p>
             <w:pPr>
+              <w:keepNext/>
               <w:spacing w:after="0"/>
               <w:jc w:val="right"/>
             </w:pPr>
@@ -1226,6 +1305,7 @@
           </w:tcPr>
           <w:p>
             <w:pPr>
+              <w:keepNext/>
               <w:spacing w:after="0"/>
               <w:jc w:val="right"/>
             </w:pPr>
@@ -1240,12 +1320,16 @@
         </w:tc>
       </w:tr>
       <w:tr>
+        <w:trPr>
+          <w:cantSplit/>
+        </w:trPr>
         <w:tc>
           <w:tcPr>
             <w:tcW w:type="dxa" w:w="850"/>
           </w:tcPr>
           <w:p>
             <w:pPr>
+              <w:keepNext/>
               <w:spacing w:after="0"/>
             </w:pPr>
             <w:r>
@@ -1263,6 +1347,7 @@
           </w:tcPr>
           <w:p>
             <w:pPr>
+              <w:keepNext/>
               <w:spacing w:after="0"/>
             </w:pPr>
             <w:r>
@@ -1280,6 +1365,7 @@
           </w:tcPr>
           <w:p>
             <w:pPr>
+              <w:keepNext/>
               <w:spacing w:after="0"/>
             </w:pPr>
             <w:r>
@@ -1297,6 +1383,7 @@
           </w:tcPr>
           <w:p>
             <w:pPr>
+              <w:keepNext/>
               <w:spacing w:after="0"/>
               <w:jc w:val="right"/>
             </w:pPr>
@@ -1315,6 +1402,7 @@
           </w:tcPr>
           <w:p>
             <w:pPr>
+              <w:keepNext/>
               <w:spacing w:after="0"/>
               <w:jc w:val="right"/>
             </w:pPr>
@@ -1329,6 +1417,9 @@
         </w:tc>
       </w:tr>
       <w:tr>
+        <w:trPr>
+          <w:cantSplit/>
+        </w:trPr>
         <w:tc>
           <w:tcPr>
             <w:tcW w:type="dxa" w:w="850"/>
@@ -1460,7 +1551,2725 @@
           <w:b/>
           <w:sz w:val="24"/>
         </w:rPr>
-        <w:t>3. Новые работы: цены ниже договорных на те же изделия — 121 166,18 ₽</w:t>
+        <w:t>3. Особенности работ на 2 и 10 этажах</w:t>
+      </w:r>
+    </w:p>
+    <w:p>
+      <w:pPr>
+        <w:ind w:firstLine="709"/>
+        <w:jc w:val="both"/>
+      </w:pPr>
+      <w:r>
+        <w:rPr>
+          <w:b w:val="0"/>
+        </w:rPr>
+        <w:t>Расценки ДС № 1 рассчитаны на типовые этажи 3, 7–9. Условия работ на 2 и 10 этажах заметно сложнее, поэтому переносить на них расценки типовых этажей без поправки некорректно.</w:t>
+      </w:r>
+    </w:p>
+    <w:p>
+      <w:pPr>
+        <w:pStyle w:val="ListBullet"/>
+        <w:jc w:val="both"/>
+      </w:pPr>
+      <w:r>
+        <w:rPr>
+          <w:b/>
+        </w:rPr>
+        <w:t>Высота этажей больше.</w:t>
+      </w:r>
+      <w:r>
+        <w:rPr>
+          <w:b w:val="0"/>
+        </w:rPr>
+        <w:t xml:space="preserve"> Монтаж ведётся на большей высоте, с подмостей и вышек. Подъём, подвес и выверка оборудования и воздуховодов занимают больше времени и требуют больше людей.</w:t>
+      </w:r>
+    </w:p>
+    <w:p>
+      <w:pPr>
+        <w:pStyle w:val="ListBullet"/>
+        <w:jc w:val="both"/>
+      </w:pPr>
+      <w:r>
+        <w:rPr>
+          <w:b/>
+        </w:rPr>
+        <w:t>Узлы сложнее.</w:t>
+      </w:r>
+      <w:r>
+        <w:rPr>
+          <w:b w:val="0"/>
+        </w:rPr>
+        <w:t xml:space="preserve"> На этих этажах больше нестандартных узлов и переходов, которые собираются и подгоняются по месту.</w:t>
+      </w:r>
+    </w:p>
+    <w:p>
+      <w:pPr>
+        <w:pStyle w:val="ListBullet"/>
+        <w:jc w:val="both"/>
+      </w:pPr>
+      <w:r>
+        <w:rPr>
+          <w:b/>
+        </w:rPr>
+        <w:t>Видовые этажи.</w:t>
+      </w:r>
+      <w:r>
+        <w:rPr>
+          <w:b w:val="0"/>
+        </w:rPr>
+        <w:t xml:space="preserve"> К качеству и внешнему виду работ на 2 и 10 этажах предъявляются повышенные требования: ровные трассы, точная выверка по осям и отметкам, аккуратная изоляция. Всё должно быть выполнено идеально, и это требует дополнительного времени на каждую операцию.</w:t>
+      </w:r>
+    </w:p>
+    <w:p>
+      <w:pPr>
+        <w:ind w:firstLine="709"/>
+        <w:jc w:val="both"/>
+      </w:pPr>
+      <w:r>
+        <w:rPr>
+          <w:b w:val="0"/>
+        </w:rPr>
+        <w:t>Позиции в разделах 4–7 просим оценивать с учётом этих условий.</w:t>
+      </w:r>
+    </w:p>
+    <w:p>
+      <w:pPr>
+        <w:keepNext/>
+        <w:spacing w:before="240" w:after="120"/>
+      </w:pPr>
+      <w:r>
+        <w:rPr>
+          <w:b/>
+          <w:sz w:val="24"/>
+        </w:rPr>
+        <w:t>4. Фанкойлы — 589 160 ₽</w:t>
+      </w:r>
+    </w:p>
+    <w:p>
+      <w:pPr>
+        <w:keepNext/>
+        <w:ind w:firstLine="709"/>
+        <w:jc w:val="both"/>
+      </w:pPr>
+      <w:r>
+        <w:rPr>
+          <w:b w:val="0"/>
+        </w:rPr>
+        <w:t>Предложено 14 000 ₽ за монтаж фанкойла вместо 25 920 ₽ на 10 этаже и 29 160 ₽ на 2 этаже. В Договоре цены на монтаж фанкойлов нет.</w:t>
+      </w:r>
+    </w:p>
+    <w:tbl>
+      <w:tblPr>
+        <w:tblStyle w:val="TableGrid"/>
+        <w:tblW w:type="auto" w:w="0"/>
+        <w:jc w:val="center"/>
+        <w:tblLayout w:type="fixed"/>
+        <w:tblLook w:firstColumn="1" w:firstRow="1" w:lastColumn="0" w:lastRow="0" w:noHBand="0" w:noVBand="1" w:val="04A0"/>
+      </w:tblPr>
+      <w:tblGrid>
+        <w:gridCol w:w="850"/>
+        <w:gridCol w:w="3628"/>
+        <w:gridCol w:w="907"/>
+        <w:gridCol w:w="1361"/>
+        <w:gridCol w:w="1361"/>
+        <w:gridCol w:w="1361"/>
+      </w:tblGrid>
+      <w:tr>
+        <w:trPr>
+          <w:cantSplit/>
+        </w:trPr>
+        <w:tc>
+          <w:tcPr>
+            <w:tcW w:type="dxa" w:w="850"/>
+            <w:shd w:val="clear" w:color="auto" w:fill="D9E1F2"/>
+          </w:tcPr>
+          <w:p>
+            <w:pPr>
+              <w:keepNext/>
+              <w:jc w:val="center"/>
+            </w:pPr>
+            <w:r/>
+            <w:r>
+              <w:rPr>
+                <w:b/>
+                <w:sz w:val="20"/>
+              </w:rPr>
+              <w:t>№ по КП</w:t>
+            </w:r>
+          </w:p>
+        </w:tc>
+        <w:tc>
+          <w:tcPr>
+            <w:tcW w:type="dxa" w:w="3628"/>
+            <w:shd w:val="clear" w:color="auto" w:fill="D9E1F2"/>
+          </w:tcPr>
+          <w:p>
+            <w:pPr>
+              <w:keepNext/>
+              <w:jc w:val="center"/>
+            </w:pPr>
+            <w:r/>
+            <w:r>
+              <w:rPr>
+                <w:b/>
+                <w:sz w:val="20"/>
+              </w:rPr>
+              <w:t>Позиция</w:t>
+            </w:r>
+          </w:p>
+        </w:tc>
+        <w:tc>
+          <w:tcPr>
+            <w:tcW w:type="dxa" w:w="907"/>
+            <w:shd w:val="clear" w:color="auto" w:fill="D9E1F2"/>
+          </w:tcPr>
+          <w:p>
+            <w:pPr>
+              <w:keepNext/>
+              <w:jc w:val="center"/>
+            </w:pPr>
+            <w:r/>
+            <w:r>
+              <w:rPr>
+                <w:b/>
+                <w:sz w:val="20"/>
+              </w:rPr>
+              <w:t>Кол-во</w:t>
+            </w:r>
+          </w:p>
+        </w:tc>
+        <w:tc>
+          <w:tcPr>
+            <w:tcW w:type="dxa" w:w="1361"/>
+            <w:shd w:val="clear" w:color="auto" w:fill="D9E1F2"/>
+          </w:tcPr>
+          <w:p>
+            <w:pPr>
+              <w:keepNext/>
+              <w:jc w:val="center"/>
+            </w:pPr>
+            <w:r/>
+            <w:r>
+              <w:rPr>
+                <w:b/>
+                <w:sz w:val="20"/>
+              </w:rPr>
+              <w:t>Наша цена, ₽</w:t>
+            </w:r>
+          </w:p>
+        </w:tc>
+        <w:tc>
+          <w:tcPr>
+            <w:tcW w:type="dxa" w:w="1361"/>
+            <w:shd w:val="clear" w:color="auto" w:fill="D9E1F2"/>
+          </w:tcPr>
+          <w:p>
+            <w:pPr>
+              <w:keepNext/>
+              <w:jc w:val="center"/>
+            </w:pPr>
+            <w:r/>
+            <w:r>
+              <w:rPr>
+                <w:b/>
+                <w:sz w:val="20"/>
+              </w:rPr>
+              <w:t>Предложено, ₽</w:t>
+            </w:r>
+          </w:p>
+        </w:tc>
+        <w:tc>
+          <w:tcPr>
+            <w:tcW w:type="dxa" w:w="1361"/>
+            <w:shd w:val="clear" w:color="auto" w:fill="D9E1F2"/>
+          </w:tcPr>
+          <w:p>
+            <w:pPr>
+              <w:keepNext/>
+              <w:jc w:val="center"/>
+            </w:pPr>
+            <w:r/>
+            <w:r>
+              <w:rPr>
+                <w:b/>
+                <w:sz w:val="20"/>
+              </w:rPr>
+              <w:t>Разница, ₽</w:t>
+            </w:r>
+          </w:p>
+        </w:tc>
+      </w:tr>
+      <w:tr>
+        <w:trPr>
+          <w:cantSplit/>
+        </w:trPr>
+        <w:tc>
+          <w:tcPr>
+            <w:tcW w:type="dxa" w:w="850"/>
+          </w:tcPr>
+          <w:p>
+            <w:pPr>
+              <w:keepNext/>
+              <w:spacing w:after="0"/>
+            </w:pPr>
+            <w:r>
+              <w:rPr>
+                <w:b w:val="0"/>
+                <w:sz w:val="20"/>
+              </w:rPr>
+              <w:t>7.1</w:t>
+            </w:r>
+          </w:p>
+        </w:tc>
+        <w:tc>
+          <w:tcPr>
+            <w:tcW w:type="dxa" w:w="3628"/>
+          </w:tcPr>
+          <w:p>
+            <w:pPr>
+              <w:keepNext/>
+              <w:spacing w:after="0"/>
+            </w:pPr>
+            <w:r>
+              <w:rPr>
+                <w:b w:val="0"/>
+                <w:sz w:val="20"/>
+              </w:rPr>
+              <w:t>Фанкойл кассетный 600×600 SK-12 (2 этаж)</w:t>
+            </w:r>
+          </w:p>
+        </w:tc>
+        <w:tc>
+          <w:tcPr>
+            <w:tcW w:type="dxa" w:w="907"/>
+          </w:tcPr>
+          <w:p>
+            <w:pPr>
+              <w:keepNext/>
+              <w:spacing w:after="0"/>
+            </w:pPr>
+            <w:r>
+              <w:rPr>
+                <w:b w:val="0"/>
+                <w:sz w:val="20"/>
+              </w:rPr>
+              <w:t>31 шт.</w:t>
+            </w:r>
+          </w:p>
+        </w:tc>
+        <w:tc>
+          <w:tcPr>
+            <w:tcW w:type="dxa" w:w="1361"/>
+          </w:tcPr>
+          <w:p>
+            <w:pPr>
+              <w:keepNext/>
+              <w:spacing w:after="0"/>
+              <w:jc w:val="right"/>
+            </w:pPr>
+            <w:r>
+              <w:rPr>
+                <w:b w:val="0"/>
+                <w:sz w:val="20"/>
+              </w:rPr>
+              <w:t>29 160</w:t>
+            </w:r>
+          </w:p>
+        </w:tc>
+        <w:tc>
+          <w:tcPr>
+            <w:tcW w:type="dxa" w:w="1361"/>
+          </w:tcPr>
+          <w:p>
+            <w:pPr>
+              <w:keepNext/>
+              <w:spacing w:after="0"/>
+              <w:jc w:val="right"/>
+            </w:pPr>
+            <w:r>
+              <w:rPr>
+                <w:b w:val="0"/>
+                <w:sz w:val="20"/>
+              </w:rPr>
+              <w:t>14 000</w:t>
+            </w:r>
+          </w:p>
+        </w:tc>
+        <w:tc>
+          <w:tcPr>
+            <w:tcW w:type="dxa" w:w="1361"/>
+          </w:tcPr>
+          <w:p>
+            <w:pPr>
+              <w:keepNext/>
+              <w:spacing w:after="0"/>
+              <w:jc w:val="right"/>
+            </w:pPr>
+            <w:r>
+              <w:rPr>
+                <w:b w:val="0"/>
+                <w:sz w:val="20"/>
+              </w:rPr>
+              <w:t>469 960</w:t>
+            </w:r>
+          </w:p>
+        </w:tc>
+      </w:tr>
+      <w:tr>
+        <w:trPr>
+          <w:cantSplit/>
+        </w:trPr>
+        <w:tc>
+          <w:tcPr>
+            <w:tcW w:type="dxa" w:w="850"/>
+          </w:tcPr>
+          <w:p>
+            <w:pPr>
+              <w:keepNext/>
+              <w:spacing w:after="0"/>
+            </w:pPr>
+            <w:r>
+              <w:rPr>
+                <w:b w:val="0"/>
+                <w:sz w:val="20"/>
+              </w:rPr>
+              <w:t>5.1</w:t>
+            </w:r>
+          </w:p>
+        </w:tc>
+        <w:tc>
+          <w:tcPr>
+            <w:tcW w:type="dxa" w:w="3628"/>
+          </w:tcPr>
+          <w:p>
+            <w:pPr>
+              <w:keepNext/>
+              <w:spacing w:after="0"/>
+            </w:pPr>
+            <w:r>
+              <w:rPr>
+                <w:b w:val="0"/>
+                <w:sz w:val="20"/>
+              </w:rPr>
+              <w:t>Фанкойл кассетный 600×600 SK-32 (10 этаж)</w:t>
+            </w:r>
+          </w:p>
+        </w:tc>
+        <w:tc>
+          <w:tcPr>
+            <w:tcW w:type="dxa" w:w="907"/>
+          </w:tcPr>
+          <w:p>
+            <w:pPr>
+              <w:keepNext/>
+              <w:spacing w:after="0"/>
+            </w:pPr>
+            <w:r>
+              <w:rPr>
+                <w:b w:val="0"/>
+                <w:sz w:val="20"/>
+              </w:rPr>
+              <w:t>10 шт.</w:t>
+            </w:r>
+          </w:p>
+        </w:tc>
+        <w:tc>
+          <w:tcPr>
+            <w:tcW w:type="dxa" w:w="1361"/>
+          </w:tcPr>
+          <w:p>
+            <w:pPr>
+              <w:keepNext/>
+              <w:spacing w:after="0"/>
+              <w:jc w:val="right"/>
+            </w:pPr>
+            <w:r>
+              <w:rPr>
+                <w:b w:val="0"/>
+                <w:sz w:val="20"/>
+              </w:rPr>
+              <w:t>25 920</w:t>
+            </w:r>
+          </w:p>
+        </w:tc>
+        <w:tc>
+          <w:tcPr>
+            <w:tcW w:type="dxa" w:w="1361"/>
+          </w:tcPr>
+          <w:p>
+            <w:pPr>
+              <w:keepNext/>
+              <w:spacing w:after="0"/>
+              <w:jc w:val="right"/>
+            </w:pPr>
+            <w:r>
+              <w:rPr>
+                <w:b w:val="0"/>
+                <w:sz w:val="20"/>
+              </w:rPr>
+              <w:t>14 000</w:t>
+            </w:r>
+          </w:p>
+        </w:tc>
+        <w:tc>
+          <w:tcPr>
+            <w:tcW w:type="dxa" w:w="1361"/>
+          </w:tcPr>
+          <w:p>
+            <w:pPr>
+              <w:keepNext/>
+              <w:spacing w:after="0"/>
+              <w:jc w:val="right"/>
+            </w:pPr>
+            <w:r>
+              <w:rPr>
+                <w:b w:val="0"/>
+                <w:sz w:val="20"/>
+              </w:rPr>
+              <w:t>119 200</w:t>
+            </w:r>
+          </w:p>
+        </w:tc>
+      </w:tr>
+      <w:tr>
+        <w:trPr>
+          <w:cantSplit/>
+        </w:trPr>
+        <w:tc>
+          <w:tcPr>
+            <w:tcW w:type="dxa" w:w="850"/>
+          </w:tcPr>
+          <w:p>
+            <w:pPr>
+              <w:spacing w:after="0"/>
+            </w:pPr>
+            <w:r>
+              <w:rPr>
+                <w:b/>
+                <w:sz w:val="20"/>
+              </w:rPr>
+            </w:r>
+          </w:p>
+        </w:tc>
+        <w:tc>
+          <w:tcPr>
+            <w:tcW w:type="dxa" w:w="3628"/>
+          </w:tcPr>
+          <w:p>
+            <w:pPr>
+              <w:spacing w:after="0"/>
+            </w:pPr>
+            <w:r>
+              <w:rPr>
+                <w:b/>
+                <w:sz w:val="20"/>
+              </w:rPr>
+              <w:t>Итого</w:t>
+            </w:r>
+          </w:p>
+        </w:tc>
+        <w:tc>
+          <w:tcPr>
+            <w:tcW w:type="dxa" w:w="907"/>
+          </w:tcPr>
+          <w:p>
+            <w:pPr>
+              <w:spacing w:after="0"/>
+            </w:pPr>
+            <w:r>
+              <w:rPr>
+                <w:b/>
+                <w:sz w:val="20"/>
+              </w:rPr>
+            </w:r>
+          </w:p>
+        </w:tc>
+        <w:tc>
+          <w:tcPr>
+            <w:tcW w:type="dxa" w:w="1361"/>
+          </w:tcPr>
+          <w:p>
+            <w:pPr>
+              <w:spacing w:after="0"/>
+              <w:jc w:val="right"/>
+            </w:pPr>
+            <w:r>
+              <w:rPr>
+                <w:b/>
+                <w:sz w:val="20"/>
+              </w:rPr>
+            </w:r>
+          </w:p>
+        </w:tc>
+        <w:tc>
+          <w:tcPr>
+            <w:tcW w:type="dxa" w:w="1361"/>
+          </w:tcPr>
+          <w:p>
+            <w:pPr>
+              <w:spacing w:after="0"/>
+              <w:jc w:val="right"/>
+            </w:pPr>
+            <w:r>
+              <w:rPr>
+                <w:b/>
+                <w:sz w:val="20"/>
+              </w:rPr>
+            </w:r>
+          </w:p>
+        </w:tc>
+        <w:tc>
+          <w:tcPr>
+            <w:tcW w:type="dxa" w:w="1361"/>
+          </w:tcPr>
+          <w:p>
+            <w:pPr>
+              <w:spacing w:after="0"/>
+              <w:jc w:val="right"/>
+            </w:pPr>
+            <w:r>
+              <w:rPr>
+                <w:b/>
+                <w:sz w:val="20"/>
+              </w:rPr>
+              <w:t>589 160</w:t>
+            </w:r>
+          </w:p>
+        </w:tc>
+      </w:tr>
+    </w:tbl>
+    <w:p>
+      <w:pPr>
+        <w:spacing w:after="0"/>
+      </w:pPr>
+    </w:p>
+    <w:p>
+      <w:pPr>
+        <w:ind w:firstLine="709"/>
+        <w:jc w:val="both"/>
+      </w:pPr>
+      <w:r>
+        <w:rPr>
+          <w:b w:val="0"/>
+        </w:rPr>
+        <w:t>На Ваш вопрос о разнице с климатическими балками (10 000 ₽):</w:t>
+      </w:r>
+    </w:p>
+    <w:p>
+      <w:pPr>
+        <w:pStyle w:val="ListBullet"/>
+        <w:jc w:val="both"/>
+      </w:pPr>
+      <w:r>
+        <w:rPr>
+          <w:b/>
+        </w:rPr>
+        <w:t>Другое оборудование.</w:t>
+      </w:r>
+      <w:r>
+        <w:rPr>
+          <w:b w:val="0"/>
+        </w:rPr>
+        <w:t xml:space="preserve"> Кассетный фанкойл — агрегат с вентилятором, теплообменником и отводом конденсата. Его нужно подвесить, выверить по уровню и по сетке потолка, подключить подачу и обратку через арматуру, подключить дренаж и проверить узел на герметичность.</w:t>
+      </w:r>
+    </w:p>
+    <w:p>
+      <w:pPr>
+        <w:pStyle w:val="ListBullet"/>
+        <w:jc w:val="both"/>
+      </w:pPr>
+      <w:r>
+        <w:rPr>
+          <w:b/>
+        </w:rPr>
+        <w:t>Высота и видовые этажи.</w:t>
+      </w:r>
+      <w:r>
+        <w:rPr>
+          <w:b w:val="0"/>
+        </w:rPr>
+        <w:t xml:space="preserve"> Все фанкойлы монтируются на 2 и 10 этажах: на большей высоте и с точной привязкой к потолку видового этажа (раздел 3). Балки монтировались на типовых этажах.</w:t>
+      </w:r>
+    </w:p>
+    <w:p>
+      <w:pPr>
+        <w:pStyle w:val="ListBullet"/>
+        <w:jc w:val="both"/>
+      </w:pPr>
+      <w:r>
+        <w:rPr>
+          <w:b/>
+        </w:rPr>
+        <w:t>Подключение исключено.</w:t>
+      </w:r>
+      <w:r>
+        <w:rPr>
+          <w:b w:val="0"/>
+        </w:rPr>
+        <w:t xml:space="preserve"> После удаления п. 7.2 подключение 31 фанкойла на 2 этаже не оплачивается вообще (раздел 2).</w:t>
+      </w:r>
+    </w:p>
+    <w:p>
+      <w:pPr>
+        <w:ind w:firstLine="709"/>
+        <w:jc w:val="both"/>
+      </w:pPr>
+      <w:r>
+        <w:rPr>
+          <w:b/>
+        </w:rPr>
+        <w:t>Просим:</w:t>
+      </w:r>
+      <w:r>
+        <w:rPr>
+          <w:b w:val="0"/>
+        </w:rPr>
+        <w:t xml:space="preserve"> сохранить цены 29 160 ₽ (п. 7.1) и 25 920 ₽ (п. 5.1).</w:t>
+      </w:r>
+    </w:p>
+    <w:p>
+      <w:pPr>
+        <w:keepNext/>
+        <w:spacing w:before="240" w:after="120"/>
+      </w:pPr>
+      <w:r>
+        <w:rPr>
+          <w:b/>
+          <w:sz w:val="24"/>
+        </w:rPr>
+        <w:t>5. Изоляция воздуховодов и фасонных изделий — 695 425 ₽</w:t>
+      </w:r>
+    </w:p>
+    <w:p>
+      <w:pPr>
+        <w:keepNext/>
+        <w:ind w:firstLine="709"/>
+        <w:jc w:val="both"/>
+      </w:pPr>
+      <w:r>
+        <w:rPr>
+          <w:b w:val="0"/>
+        </w:rPr>
+        <w:t>Ранее в рабочем порядке нам было подтверждено, что расценки на изоляцию будут согласованы. Просим сохранить их в редакции нашего КП.</w:t>
+      </w:r>
+    </w:p>
+    <w:tbl>
+      <w:tblPr>
+        <w:tblStyle w:val="TableGrid"/>
+        <w:tblW w:type="auto" w:w="0"/>
+        <w:jc w:val="center"/>
+        <w:tblLayout w:type="fixed"/>
+        <w:tblLook w:firstColumn="1" w:firstRow="1" w:lastColumn="0" w:lastRow="0" w:noHBand="0" w:noVBand="1" w:val="04A0"/>
+      </w:tblPr>
+      <w:tblGrid>
+        <w:gridCol w:w="850"/>
+        <w:gridCol w:w="3628"/>
+        <w:gridCol w:w="907"/>
+        <w:gridCol w:w="1361"/>
+        <w:gridCol w:w="1361"/>
+        <w:gridCol w:w="1361"/>
+      </w:tblGrid>
+      <w:tr>
+        <w:trPr>
+          <w:cantSplit/>
+        </w:trPr>
+        <w:tc>
+          <w:tcPr>
+            <w:tcW w:type="dxa" w:w="850"/>
+            <w:shd w:val="clear" w:color="auto" w:fill="D9E1F2"/>
+          </w:tcPr>
+          <w:p>
+            <w:pPr>
+              <w:keepNext/>
+              <w:jc w:val="center"/>
+            </w:pPr>
+            <w:r/>
+            <w:r>
+              <w:rPr>
+                <w:b/>
+                <w:sz w:val="20"/>
+              </w:rPr>
+              <w:t>№ по КП</w:t>
+            </w:r>
+          </w:p>
+        </w:tc>
+        <w:tc>
+          <w:tcPr>
+            <w:tcW w:type="dxa" w:w="3628"/>
+            <w:shd w:val="clear" w:color="auto" w:fill="D9E1F2"/>
+          </w:tcPr>
+          <w:p>
+            <w:pPr>
+              <w:keepNext/>
+              <w:jc w:val="center"/>
+            </w:pPr>
+            <w:r/>
+            <w:r>
+              <w:rPr>
+                <w:b/>
+                <w:sz w:val="20"/>
+              </w:rPr>
+              <w:t>Позиция</w:t>
+            </w:r>
+          </w:p>
+        </w:tc>
+        <w:tc>
+          <w:tcPr>
+            <w:tcW w:type="dxa" w:w="907"/>
+            <w:shd w:val="clear" w:color="auto" w:fill="D9E1F2"/>
+          </w:tcPr>
+          <w:p>
+            <w:pPr>
+              <w:keepNext/>
+              <w:jc w:val="center"/>
+            </w:pPr>
+            <w:r/>
+            <w:r>
+              <w:rPr>
+                <w:b/>
+                <w:sz w:val="20"/>
+              </w:rPr>
+              <w:t>Кол-во</w:t>
+            </w:r>
+          </w:p>
+        </w:tc>
+        <w:tc>
+          <w:tcPr>
+            <w:tcW w:type="dxa" w:w="1361"/>
+            <w:shd w:val="clear" w:color="auto" w:fill="D9E1F2"/>
+          </w:tcPr>
+          <w:p>
+            <w:pPr>
+              <w:keepNext/>
+              <w:jc w:val="center"/>
+            </w:pPr>
+            <w:r/>
+            <w:r>
+              <w:rPr>
+                <w:b/>
+                <w:sz w:val="20"/>
+              </w:rPr>
+              <w:t>Наша цена, ₽</w:t>
+            </w:r>
+          </w:p>
+        </w:tc>
+        <w:tc>
+          <w:tcPr>
+            <w:tcW w:type="dxa" w:w="1361"/>
+            <w:shd w:val="clear" w:color="auto" w:fill="D9E1F2"/>
+          </w:tcPr>
+          <w:p>
+            <w:pPr>
+              <w:keepNext/>
+              <w:jc w:val="center"/>
+            </w:pPr>
+            <w:r/>
+            <w:r>
+              <w:rPr>
+                <w:b/>
+                <w:sz w:val="20"/>
+              </w:rPr>
+              <w:t>Предложено, ₽</w:t>
+            </w:r>
+          </w:p>
+        </w:tc>
+        <w:tc>
+          <w:tcPr>
+            <w:tcW w:type="dxa" w:w="1361"/>
+            <w:shd w:val="clear" w:color="auto" w:fill="D9E1F2"/>
+          </w:tcPr>
+          <w:p>
+            <w:pPr>
+              <w:keepNext/>
+              <w:jc w:val="center"/>
+            </w:pPr>
+            <w:r/>
+            <w:r>
+              <w:rPr>
+                <w:b/>
+                <w:sz w:val="20"/>
+              </w:rPr>
+              <w:t>Разница, ₽</w:t>
+            </w:r>
+          </w:p>
+        </w:tc>
+      </w:tr>
+      <w:tr>
+        <w:trPr>
+          <w:cantSplit/>
+        </w:trPr>
+        <w:tc>
+          <w:tcPr>
+            <w:tcW w:type="dxa" w:w="850"/>
+          </w:tcPr>
+          <w:p>
+            <w:pPr>
+              <w:keepNext/>
+              <w:spacing w:after="0"/>
+            </w:pPr>
+            <w:r>
+              <w:rPr>
+                <w:b w:val="0"/>
+                <w:sz w:val="20"/>
+              </w:rPr>
+              <w:t>3.7</w:t>
+            </w:r>
+          </w:p>
+        </w:tc>
+        <w:tc>
+          <w:tcPr>
+            <w:tcW w:type="dxa" w:w="3628"/>
+          </w:tcPr>
+          <w:p>
+            <w:pPr>
+              <w:keepNext/>
+              <w:spacing w:after="0"/>
+            </w:pPr>
+            <w:r>
+              <w:rPr>
+                <w:b w:val="0"/>
+                <w:sz w:val="20"/>
+              </w:rPr>
+              <w:t>Изоляция изделий (отводы, тройники, переходы, клапаны), 3, 7–9 эт.</w:t>
+            </w:r>
+          </w:p>
+        </w:tc>
+        <w:tc>
+          <w:tcPr>
+            <w:tcW w:type="dxa" w:w="907"/>
+          </w:tcPr>
+          <w:p>
+            <w:pPr>
+              <w:keepNext/>
+              <w:spacing w:after="0"/>
+            </w:pPr>
+            <w:r>
+              <w:rPr>
+                <w:b w:val="0"/>
+                <w:sz w:val="20"/>
+              </w:rPr>
+              <w:t>1 195 шт.</w:t>
+            </w:r>
+          </w:p>
+        </w:tc>
+        <w:tc>
+          <w:tcPr>
+            <w:tcW w:type="dxa" w:w="1361"/>
+          </w:tcPr>
+          <w:p>
+            <w:pPr>
+              <w:keepNext/>
+              <w:spacing w:after="0"/>
+              <w:jc w:val="right"/>
+            </w:pPr>
+            <w:r>
+              <w:rPr>
+                <w:b w:val="0"/>
+                <w:sz w:val="20"/>
+              </w:rPr>
+              <w:t>840</w:t>
+            </w:r>
+          </w:p>
+        </w:tc>
+        <w:tc>
+          <w:tcPr>
+            <w:tcW w:type="dxa" w:w="1361"/>
+          </w:tcPr>
+          <w:p>
+            <w:pPr>
+              <w:keepNext/>
+              <w:spacing w:after="0"/>
+              <w:jc w:val="right"/>
+            </w:pPr>
+            <w:r>
+              <w:rPr>
+                <w:b w:val="0"/>
+                <w:sz w:val="20"/>
+              </w:rPr>
+              <w:t>570</w:t>
+            </w:r>
+          </w:p>
+        </w:tc>
+        <w:tc>
+          <w:tcPr>
+            <w:tcW w:type="dxa" w:w="1361"/>
+          </w:tcPr>
+          <w:p>
+            <w:pPr>
+              <w:keepNext/>
+              <w:spacing w:after="0"/>
+              <w:jc w:val="right"/>
+            </w:pPr>
+            <w:r>
+              <w:rPr>
+                <w:b w:val="0"/>
+                <w:sz w:val="20"/>
+              </w:rPr>
+              <w:t>322 650</w:t>
+            </w:r>
+          </w:p>
+        </w:tc>
+      </w:tr>
+      <w:tr>
+        <w:trPr>
+          <w:cantSplit/>
+        </w:trPr>
+        <w:tc>
+          <w:tcPr>
+            <w:tcW w:type="dxa" w:w="850"/>
+          </w:tcPr>
+          <w:p>
+            <w:pPr>
+              <w:keepNext/>
+              <w:spacing w:after="0"/>
+            </w:pPr>
+            <w:r>
+              <w:rPr>
+                <w:b w:val="0"/>
+                <w:sz w:val="20"/>
+              </w:rPr>
+              <w:t>4.81</w:t>
+            </w:r>
+          </w:p>
+        </w:tc>
+        <w:tc>
+          <w:tcPr>
+            <w:tcW w:type="dxa" w:w="3628"/>
+          </w:tcPr>
+          <w:p>
+            <w:pPr>
+              <w:keepNext/>
+              <w:spacing w:after="0"/>
+            </w:pPr>
+            <w:r>
+              <w:rPr>
+                <w:b w:val="0"/>
+                <w:sz w:val="20"/>
+              </w:rPr>
+              <w:t>Изоляция прямоугольного изделия, 10 эт.</w:t>
+            </w:r>
+          </w:p>
+        </w:tc>
+        <w:tc>
+          <w:tcPr>
+            <w:tcW w:type="dxa" w:w="907"/>
+          </w:tcPr>
+          <w:p>
+            <w:pPr>
+              <w:keepNext/>
+              <w:spacing w:after="0"/>
+            </w:pPr>
+            <w:r>
+              <w:rPr>
+                <w:b w:val="0"/>
+                <w:sz w:val="20"/>
+              </w:rPr>
+              <w:t>80 шт.</w:t>
+            </w:r>
+          </w:p>
+        </w:tc>
+        <w:tc>
+          <w:tcPr>
+            <w:tcW w:type="dxa" w:w="1361"/>
+          </w:tcPr>
+          <w:p>
+            <w:pPr>
+              <w:keepNext/>
+              <w:spacing w:after="0"/>
+              <w:jc w:val="right"/>
+            </w:pPr>
+            <w:r>
+              <w:rPr>
+                <w:b w:val="0"/>
+                <w:sz w:val="20"/>
+              </w:rPr>
+              <w:t>3 240</w:t>
+            </w:r>
+          </w:p>
+        </w:tc>
+        <w:tc>
+          <w:tcPr>
+            <w:tcW w:type="dxa" w:w="1361"/>
+          </w:tcPr>
+          <w:p>
+            <w:pPr>
+              <w:keepNext/>
+              <w:spacing w:after="0"/>
+              <w:jc w:val="right"/>
+            </w:pPr>
+            <w:r>
+              <w:rPr>
+                <w:b w:val="0"/>
+                <w:sz w:val="20"/>
+              </w:rPr>
+              <w:t>665</w:t>
+            </w:r>
+          </w:p>
+        </w:tc>
+        <w:tc>
+          <w:tcPr>
+            <w:tcW w:type="dxa" w:w="1361"/>
+          </w:tcPr>
+          <w:p>
+            <w:pPr>
+              <w:keepNext/>
+              <w:spacing w:after="0"/>
+              <w:jc w:val="right"/>
+            </w:pPr>
+            <w:r>
+              <w:rPr>
+                <w:b w:val="0"/>
+                <w:sz w:val="20"/>
+              </w:rPr>
+              <w:t>206 000</w:t>
+            </w:r>
+          </w:p>
+        </w:tc>
+      </w:tr>
+      <w:tr>
+        <w:trPr>
+          <w:cantSplit/>
+        </w:trPr>
+        <w:tc>
+          <w:tcPr>
+            <w:tcW w:type="dxa" w:w="850"/>
+          </w:tcPr>
+          <w:p>
+            <w:pPr>
+              <w:keepNext/>
+              <w:spacing w:after="0"/>
+            </w:pPr>
+            <w:r>
+              <w:rPr>
+                <w:b w:val="0"/>
+                <w:sz w:val="20"/>
+              </w:rPr>
+              <w:t>4.82</w:t>
+            </w:r>
+          </w:p>
+        </w:tc>
+        <w:tc>
+          <w:tcPr>
+            <w:tcW w:type="dxa" w:w="3628"/>
+          </w:tcPr>
+          <w:p>
+            <w:pPr>
+              <w:keepNext/>
+              <w:spacing w:after="0"/>
+            </w:pPr>
+            <w:r>
+              <w:rPr>
+                <w:b w:val="0"/>
+                <w:sz w:val="20"/>
+              </w:rPr>
+              <w:t>Изоляция прямоугольных воздуховодов, 10 эт.</w:t>
+            </w:r>
+          </w:p>
+        </w:tc>
+        <w:tc>
+          <w:tcPr>
+            <w:tcW w:type="dxa" w:w="907"/>
+          </w:tcPr>
+          <w:p>
+            <w:pPr>
+              <w:keepNext/>
+              <w:spacing w:after="0"/>
+            </w:pPr>
+            <w:r>
+              <w:rPr>
+                <w:b w:val="0"/>
+                <w:sz w:val="20"/>
+              </w:rPr>
+              <w:t>120 м²</w:t>
+            </w:r>
+          </w:p>
+        </w:tc>
+        <w:tc>
+          <w:tcPr>
+            <w:tcW w:type="dxa" w:w="1361"/>
+          </w:tcPr>
+          <w:p>
+            <w:pPr>
+              <w:keepNext/>
+              <w:spacing w:after="0"/>
+              <w:jc w:val="right"/>
+            </w:pPr>
+            <w:r>
+              <w:rPr>
+                <w:b w:val="0"/>
+                <w:sz w:val="20"/>
+              </w:rPr>
+              <w:t>1 092</w:t>
+            </w:r>
+          </w:p>
+        </w:tc>
+        <w:tc>
+          <w:tcPr>
+            <w:tcW w:type="dxa" w:w="1361"/>
+          </w:tcPr>
+          <w:p>
+            <w:pPr>
+              <w:keepNext/>
+              <w:spacing w:after="0"/>
+              <w:jc w:val="right"/>
+            </w:pPr>
+            <w:r>
+              <w:rPr>
+                <w:b w:val="0"/>
+                <w:sz w:val="20"/>
+              </w:rPr>
+              <w:t>665</w:t>
+            </w:r>
+          </w:p>
+        </w:tc>
+        <w:tc>
+          <w:tcPr>
+            <w:tcW w:type="dxa" w:w="1361"/>
+          </w:tcPr>
+          <w:p>
+            <w:pPr>
+              <w:keepNext/>
+              <w:spacing w:after="0"/>
+              <w:jc w:val="right"/>
+            </w:pPr>
+            <w:r>
+              <w:rPr>
+                <w:b w:val="0"/>
+                <w:sz w:val="20"/>
+              </w:rPr>
+              <w:t>51 240</w:t>
+            </w:r>
+          </w:p>
+        </w:tc>
+      </w:tr>
+      <w:tr>
+        <w:trPr>
+          <w:cantSplit/>
+        </w:trPr>
+        <w:tc>
+          <w:tcPr>
+            <w:tcW w:type="dxa" w:w="850"/>
+          </w:tcPr>
+          <w:p>
+            <w:pPr>
+              <w:keepNext/>
+              <w:spacing w:after="0"/>
+            </w:pPr>
+            <w:r>
+              <w:rPr>
+                <w:b w:val="0"/>
+                <w:sz w:val="20"/>
+              </w:rPr>
+              <w:t>6.72</w:t>
+            </w:r>
+          </w:p>
+        </w:tc>
+        <w:tc>
+          <w:tcPr>
+            <w:tcW w:type="dxa" w:w="3628"/>
+          </w:tcPr>
+          <w:p>
+            <w:pPr>
+              <w:keepNext/>
+              <w:spacing w:after="0"/>
+            </w:pPr>
+            <w:r>
+              <w:rPr>
+                <w:b w:val="0"/>
+                <w:sz w:val="20"/>
+              </w:rPr>
+              <w:t>Изоляция прямоугольных воздуховодов, 2 эт.</w:t>
+            </w:r>
+          </w:p>
+        </w:tc>
+        <w:tc>
+          <w:tcPr>
+            <w:tcW w:type="dxa" w:w="907"/>
+          </w:tcPr>
+          <w:p>
+            <w:pPr>
+              <w:keepNext/>
+              <w:spacing w:after="0"/>
+            </w:pPr>
+            <w:r>
+              <w:rPr>
+                <w:b w:val="0"/>
+                <w:sz w:val="20"/>
+              </w:rPr>
+              <w:t>150 м²</w:t>
+            </w:r>
+          </w:p>
+        </w:tc>
+        <w:tc>
+          <w:tcPr>
+            <w:tcW w:type="dxa" w:w="1361"/>
+          </w:tcPr>
+          <w:p>
+            <w:pPr>
+              <w:keepNext/>
+              <w:spacing w:after="0"/>
+              <w:jc w:val="right"/>
+            </w:pPr>
+            <w:r>
+              <w:rPr>
+                <w:b w:val="0"/>
+                <w:sz w:val="20"/>
+              </w:rPr>
+              <w:t>1 092</w:t>
+            </w:r>
+          </w:p>
+        </w:tc>
+        <w:tc>
+          <w:tcPr>
+            <w:tcW w:type="dxa" w:w="1361"/>
+          </w:tcPr>
+          <w:p>
+            <w:pPr>
+              <w:keepNext/>
+              <w:spacing w:after="0"/>
+              <w:jc w:val="right"/>
+            </w:pPr>
+            <w:r>
+              <w:rPr>
+                <w:b w:val="0"/>
+                <w:sz w:val="20"/>
+              </w:rPr>
+              <w:t>800</w:t>
+            </w:r>
+          </w:p>
+        </w:tc>
+        <w:tc>
+          <w:tcPr>
+            <w:tcW w:type="dxa" w:w="1361"/>
+          </w:tcPr>
+          <w:p>
+            <w:pPr>
+              <w:keepNext/>
+              <w:spacing w:after="0"/>
+              <w:jc w:val="right"/>
+            </w:pPr>
+            <w:r>
+              <w:rPr>
+                <w:b w:val="0"/>
+                <w:sz w:val="20"/>
+              </w:rPr>
+              <w:t>43 800</w:t>
+            </w:r>
+          </w:p>
+        </w:tc>
+      </w:tr>
+      <w:tr>
+        <w:trPr>
+          <w:cantSplit/>
+        </w:trPr>
+        <w:tc>
+          <w:tcPr>
+            <w:tcW w:type="dxa" w:w="850"/>
+          </w:tcPr>
+          <w:p>
+            <w:pPr>
+              <w:keepNext/>
+              <w:spacing w:after="0"/>
+            </w:pPr>
+            <w:r>
+              <w:rPr>
+                <w:b w:val="0"/>
+                <w:sz w:val="20"/>
+              </w:rPr>
+              <w:t>4.83</w:t>
+            </w:r>
+          </w:p>
+        </w:tc>
+        <w:tc>
+          <w:tcPr>
+            <w:tcW w:type="dxa" w:w="3628"/>
+          </w:tcPr>
+          <w:p>
+            <w:pPr>
+              <w:keepNext/>
+              <w:spacing w:after="0"/>
+            </w:pPr>
+            <w:r>
+              <w:rPr>
+                <w:b w:val="0"/>
+                <w:sz w:val="20"/>
+              </w:rPr>
+              <w:t>Изоляция круглых воздуховодов, 10 эт.</w:t>
+            </w:r>
+          </w:p>
+        </w:tc>
+        <w:tc>
+          <w:tcPr>
+            <w:tcW w:type="dxa" w:w="907"/>
+          </w:tcPr>
+          <w:p>
+            <w:pPr>
+              <w:keepNext/>
+              <w:spacing w:after="0"/>
+            </w:pPr>
+            <w:r>
+              <w:rPr>
+                <w:b w:val="0"/>
+                <w:sz w:val="20"/>
+              </w:rPr>
+              <w:t>81 м.п.</w:t>
+            </w:r>
+          </w:p>
+        </w:tc>
+        <w:tc>
+          <w:tcPr>
+            <w:tcW w:type="dxa" w:w="1361"/>
+          </w:tcPr>
+          <w:p>
+            <w:pPr>
+              <w:keepNext/>
+              <w:spacing w:after="0"/>
+              <w:jc w:val="right"/>
+            </w:pPr>
+            <w:r>
+              <w:rPr>
+                <w:b w:val="0"/>
+                <w:sz w:val="20"/>
+              </w:rPr>
+              <w:t>1 020</w:t>
+            </w:r>
+          </w:p>
+        </w:tc>
+        <w:tc>
+          <w:tcPr>
+            <w:tcW w:type="dxa" w:w="1361"/>
+          </w:tcPr>
+          <w:p>
+            <w:pPr>
+              <w:keepNext/>
+              <w:spacing w:after="0"/>
+              <w:jc w:val="right"/>
+            </w:pPr>
+            <w:r>
+              <w:rPr>
+                <w:b w:val="0"/>
+                <w:sz w:val="20"/>
+              </w:rPr>
+              <w:t>665</w:t>
+            </w:r>
+          </w:p>
+        </w:tc>
+        <w:tc>
+          <w:tcPr>
+            <w:tcW w:type="dxa" w:w="1361"/>
+          </w:tcPr>
+          <w:p>
+            <w:pPr>
+              <w:keepNext/>
+              <w:spacing w:after="0"/>
+              <w:jc w:val="right"/>
+            </w:pPr>
+            <w:r>
+              <w:rPr>
+                <w:b w:val="0"/>
+                <w:sz w:val="20"/>
+              </w:rPr>
+              <w:t>28 755</w:t>
+            </w:r>
+          </w:p>
+        </w:tc>
+      </w:tr>
+      <w:tr>
+        <w:trPr>
+          <w:cantSplit/>
+        </w:trPr>
+        <w:tc>
+          <w:tcPr>
+            <w:tcW w:type="dxa" w:w="850"/>
+          </w:tcPr>
+          <w:p>
+            <w:pPr>
+              <w:keepNext/>
+              <w:spacing w:after="0"/>
+            </w:pPr>
+            <w:r>
+              <w:rPr>
+                <w:b w:val="0"/>
+                <w:sz w:val="20"/>
+              </w:rPr>
+              <w:t>4.80</w:t>
+            </w:r>
+          </w:p>
+        </w:tc>
+        <w:tc>
+          <w:tcPr>
+            <w:tcW w:type="dxa" w:w="3628"/>
+          </w:tcPr>
+          <w:p>
+            <w:pPr>
+              <w:keepNext/>
+              <w:spacing w:after="0"/>
+            </w:pPr>
+            <w:r>
+              <w:rPr>
+                <w:b w:val="0"/>
+                <w:sz w:val="20"/>
+              </w:rPr>
+              <w:t>Изоляция круглого изделия Ø100–250, 10 эт.</w:t>
+            </w:r>
+          </w:p>
+        </w:tc>
+        <w:tc>
+          <w:tcPr>
+            <w:tcW w:type="dxa" w:w="907"/>
+          </w:tcPr>
+          <w:p>
+            <w:pPr>
+              <w:keepNext/>
+              <w:spacing w:after="0"/>
+            </w:pPr>
+            <w:r>
+              <w:rPr>
+                <w:b w:val="0"/>
+                <w:sz w:val="20"/>
+              </w:rPr>
+              <w:t>30 шт.</w:t>
+            </w:r>
+          </w:p>
+        </w:tc>
+        <w:tc>
+          <w:tcPr>
+            <w:tcW w:type="dxa" w:w="1361"/>
+          </w:tcPr>
+          <w:p>
+            <w:pPr>
+              <w:keepNext/>
+              <w:spacing w:after="0"/>
+              <w:jc w:val="right"/>
+            </w:pPr>
+            <w:r>
+              <w:rPr>
+                <w:b w:val="0"/>
+                <w:sz w:val="20"/>
+              </w:rPr>
+              <w:t>1 296</w:t>
+            </w:r>
+          </w:p>
+        </w:tc>
+        <w:tc>
+          <w:tcPr>
+            <w:tcW w:type="dxa" w:w="1361"/>
+          </w:tcPr>
+          <w:p>
+            <w:pPr>
+              <w:keepNext/>
+              <w:spacing w:after="0"/>
+              <w:jc w:val="right"/>
+            </w:pPr>
+            <w:r>
+              <w:rPr>
+                <w:b w:val="0"/>
+                <w:sz w:val="20"/>
+              </w:rPr>
+              <w:t>450</w:t>
+            </w:r>
+          </w:p>
+        </w:tc>
+        <w:tc>
+          <w:tcPr>
+            <w:tcW w:type="dxa" w:w="1361"/>
+          </w:tcPr>
+          <w:p>
+            <w:pPr>
+              <w:keepNext/>
+              <w:spacing w:after="0"/>
+              <w:jc w:val="right"/>
+            </w:pPr>
+            <w:r>
+              <w:rPr>
+                <w:b w:val="0"/>
+                <w:sz w:val="20"/>
+              </w:rPr>
+              <w:t>25 380</w:t>
+            </w:r>
+          </w:p>
+        </w:tc>
+      </w:tr>
+      <w:tr>
+        <w:trPr>
+          <w:cantSplit/>
+        </w:trPr>
+        <w:tc>
+          <w:tcPr>
+            <w:tcW w:type="dxa" w:w="850"/>
+          </w:tcPr>
+          <w:p>
+            <w:pPr>
+              <w:keepNext/>
+              <w:spacing w:after="0"/>
+            </w:pPr>
+            <w:r>
+              <w:rPr>
+                <w:b w:val="0"/>
+                <w:sz w:val="20"/>
+              </w:rPr>
+              <w:t>6.73</w:t>
+            </w:r>
+          </w:p>
+        </w:tc>
+        <w:tc>
+          <w:tcPr>
+            <w:tcW w:type="dxa" w:w="3628"/>
+          </w:tcPr>
+          <w:p>
+            <w:pPr>
+              <w:keepNext/>
+              <w:spacing w:after="0"/>
+            </w:pPr>
+            <w:r>
+              <w:rPr>
+                <w:b w:val="0"/>
+                <w:sz w:val="20"/>
+              </w:rPr>
+              <w:t>Изоляция круглых воздуховодов, 2 эт.</w:t>
+            </w:r>
+          </w:p>
+        </w:tc>
+        <w:tc>
+          <w:tcPr>
+            <w:tcW w:type="dxa" w:w="907"/>
+          </w:tcPr>
+          <w:p>
+            <w:pPr>
+              <w:keepNext/>
+              <w:spacing w:after="0"/>
+            </w:pPr>
+            <w:r>
+              <w:rPr>
+                <w:b w:val="0"/>
+                <w:sz w:val="20"/>
+              </w:rPr>
+              <w:t>80 м.п.</w:t>
+            </w:r>
+          </w:p>
+        </w:tc>
+        <w:tc>
+          <w:tcPr>
+            <w:tcW w:type="dxa" w:w="1361"/>
+          </w:tcPr>
+          <w:p>
+            <w:pPr>
+              <w:keepNext/>
+              <w:spacing w:after="0"/>
+              <w:jc w:val="right"/>
+            </w:pPr>
+            <w:r>
+              <w:rPr>
+                <w:b w:val="0"/>
+                <w:sz w:val="20"/>
+              </w:rPr>
+              <w:t>1 020</w:t>
+            </w:r>
+          </w:p>
+        </w:tc>
+        <w:tc>
+          <w:tcPr>
+            <w:tcW w:type="dxa" w:w="1361"/>
+          </w:tcPr>
+          <w:p>
+            <w:pPr>
+              <w:keepNext/>
+              <w:spacing w:after="0"/>
+              <w:jc w:val="right"/>
+            </w:pPr>
+            <w:r>
+              <w:rPr>
+                <w:b w:val="0"/>
+                <w:sz w:val="20"/>
+              </w:rPr>
+              <w:t>800</w:t>
+            </w:r>
+          </w:p>
+        </w:tc>
+        <w:tc>
+          <w:tcPr>
+            <w:tcW w:type="dxa" w:w="1361"/>
+          </w:tcPr>
+          <w:p>
+            <w:pPr>
+              <w:keepNext/>
+              <w:spacing w:after="0"/>
+              <w:jc w:val="right"/>
+            </w:pPr>
+            <w:r>
+              <w:rPr>
+                <w:b w:val="0"/>
+                <w:sz w:val="20"/>
+              </w:rPr>
+              <w:t>17 600</w:t>
+            </w:r>
+          </w:p>
+        </w:tc>
+      </w:tr>
+      <w:tr>
+        <w:trPr>
+          <w:cantSplit/>
+        </w:trPr>
+        <w:tc>
+          <w:tcPr>
+            <w:tcW w:type="dxa" w:w="850"/>
+          </w:tcPr>
+          <w:p>
+            <w:pPr>
+              <w:spacing w:after="0"/>
+            </w:pPr>
+            <w:r>
+              <w:rPr>
+                <w:b/>
+                <w:sz w:val="20"/>
+              </w:rPr>
+            </w:r>
+          </w:p>
+        </w:tc>
+        <w:tc>
+          <w:tcPr>
+            <w:tcW w:type="dxa" w:w="3628"/>
+          </w:tcPr>
+          <w:p>
+            <w:pPr>
+              <w:spacing w:after="0"/>
+            </w:pPr>
+            <w:r>
+              <w:rPr>
+                <w:b/>
+                <w:sz w:val="20"/>
+              </w:rPr>
+              <w:t>Итого</w:t>
+            </w:r>
+          </w:p>
+        </w:tc>
+        <w:tc>
+          <w:tcPr>
+            <w:tcW w:type="dxa" w:w="907"/>
+          </w:tcPr>
+          <w:p>
+            <w:pPr>
+              <w:spacing w:after="0"/>
+            </w:pPr>
+            <w:r>
+              <w:rPr>
+                <w:b/>
+                <w:sz w:val="20"/>
+              </w:rPr>
+            </w:r>
+          </w:p>
+        </w:tc>
+        <w:tc>
+          <w:tcPr>
+            <w:tcW w:type="dxa" w:w="1361"/>
+          </w:tcPr>
+          <w:p>
+            <w:pPr>
+              <w:spacing w:after="0"/>
+              <w:jc w:val="right"/>
+            </w:pPr>
+            <w:r>
+              <w:rPr>
+                <w:b/>
+                <w:sz w:val="20"/>
+              </w:rPr>
+            </w:r>
+          </w:p>
+        </w:tc>
+        <w:tc>
+          <w:tcPr>
+            <w:tcW w:type="dxa" w:w="1361"/>
+          </w:tcPr>
+          <w:p>
+            <w:pPr>
+              <w:spacing w:after="0"/>
+              <w:jc w:val="right"/>
+            </w:pPr>
+            <w:r>
+              <w:rPr>
+                <w:b/>
+                <w:sz w:val="20"/>
+              </w:rPr>
+            </w:r>
+          </w:p>
+        </w:tc>
+        <w:tc>
+          <w:tcPr>
+            <w:tcW w:type="dxa" w:w="1361"/>
+          </w:tcPr>
+          <w:p>
+            <w:pPr>
+              <w:spacing w:after="0"/>
+              <w:jc w:val="right"/>
+            </w:pPr>
+            <w:r>
+              <w:rPr>
+                <w:b/>
+                <w:sz w:val="20"/>
+              </w:rPr>
+              <w:t>695 425</w:t>
+            </w:r>
+          </w:p>
+        </w:tc>
+      </w:tr>
+    </w:tbl>
+    <w:p>
+      <w:pPr>
+        <w:spacing w:after="0"/>
+      </w:pPr>
+    </w:p>
+    <w:p>
+      <w:pPr>
+        <w:pStyle w:val="ListBullet"/>
+        <w:jc w:val="both"/>
+      </w:pPr>
+      <w:r>
+        <w:rPr>
+          <w:b/>
+        </w:rPr>
+        <w:t>Трудоёмкость.</w:t>
+      </w:r>
+      <w:r>
+        <w:rPr>
+          <w:b w:val="0"/>
+        </w:rPr>
+        <w:t xml:space="preserve"> Изоляция — тяжёлая ручная работа, которая занимает много времени: раскрой, подгонка по месту, проклейка швов и стыков.</w:t>
+      </w:r>
+    </w:p>
+    <w:p>
+      <w:pPr>
+        <w:pStyle w:val="ListBullet"/>
+        <w:jc w:val="both"/>
+      </w:pPr>
+      <w:r>
+        <w:rPr>
+          <w:b/>
+        </w:rPr>
+        <w:t>Изделия — за штуку, а не за м².</w:t>
+      </w:r>
+      <w:r>
+        <w:rPr>
+          <w:b w:val="0"/>
+        </w:rPr>
+        <w:t xml:space="preserve"> На отводах, тройниках и переходах раскрой сложный, и изоляция одного изделия занимает намного больше времени, чем такая же площадь прямого воздуховода. Поэтому расценка по площади на изделия не применима.</w:t>
+      </w:r>
+    </w:p>
+    <w:p>
+      <w:pPr>
+        <w:pStyle w:val="ListBullet"/>
+        <w:jc w:val="both"/>
+      </w:pPr>
+      <w:r>
+        <w:rPr>
+          <w:b/>
+        </w:rPr>
+        <w:t>Переделки.</w:t>
+      </w:r>
+      <w:r>
+        <w:rPr>
+          <w:b w:val="0"/>
+        </w:rPr>
+        <w:t xml:space="preserve"> Изоляцию приходится неоднократно переделывать, и эти повторные работы отдельно не оплачиваются.</w:t>
+      </w:r>
+    </w:p>
+    <w:p>
+      <w:pPr>
+        <w:pStyle w:val="ListBullet"/>
+        <w:jc w:val="both"/>
+      </w:pPr>
+      <w:r>
+        <w:rPr>
+          <w:b/>
+        </w:rPr>
+        <w:t>Материал.</w:t>
+      </w:r>
+      <w:r>
+        <w:rPr>
+          <w:b w:val="0"/>
+        </w:rPr>
+        <w:t xml:space="preserve"> Изоляционный материал на объекте низкого качества. Мы работаем с тем материалом, который есть, и это дополнительно увеличивает трудозатраты.</w:t>
+      </w:r>
+    </w:p>
+    <w:p>
+      <w:pPr>
+        <w:pStyle w:val="ListBullet"/>
+        <w:jc w:val="both"/>
+      </w:pPr>
+      <w:r>
+        <w:rPr>
+          <w:b/>
+        </w:rPr>
+        <w:t>2 и 10 этажи.</w:t>
+      </w:r>
+      <w:r>
+        <w:rPr>
+          <w:b w:val="0"/>
+        </w:rPr>
+        <w:t xml:space="preserve"> Работа ведётся на большей высоте, а на видовых этажах изоляция должна быть выполнена идеально (раздел 3).</w:t>
+      </w:r>
+    </w:p>
+    <w:p>
+      <w:pPr>
+        <w:ind w:firstLine="709"/>
+        <w:jc w:val="both"/>
+      </w:pPr>
+      <w:r>
+        <w:rPr>
+          <w:b/>
+        </w:rPr>
+        <w:t>Просим:</w:t>
+      </w:r>
+      <w:r>
+        <w:rPr>
+          <w:b w:val="0"/>
+        </w:rPr>
+        <w:t xml:space="preserve"> сохранить расценки нашего КП по изоляции.</w:t>
+      </w:r>
+    </w:p>
+    <w:p>
+      <w:pPr>
+        <w:keepNext/>
+        <w:spacing w:before="240" w:after="120"/>
+      </w:pPr>
+      <w:r>
+        <w:rPr>
+          <w:b/>
+          <w:sz w:val="24"/>
+        </w:rPr>
+        <w:t>6. Дополнительные работы на 3, 7–9 этажах — 204 800 ₽</w:t>
+      </w:r>
+    </w:p>
+    <w:p>
+      <w:pPr>
+        <w:keepNext/>
+        <w:ind w:firstLine="709"/>
+        <w:jc w:val="both"/>
+      </w:pPr>
+      <w:r>
+        <w:rPr>
+          <w:b w:val="0"/>
+        </w:rPr>
+        <w:t>Эти работы возникли по ходу монтажа и выполняются в уже смонтированных потолках и существующих сетях. Каждая из них включает несколько операций, а не один монтаж.</w:t>
+      </w:r>
+    </w:p>
+    <w:tbl>
+      <w:tblPr>
+        <w:tblStyle w:val="TableGrid"/>
+        <w:tblW w:type="auto" w:w="0"/>
+        <w:jc w:val="center"/>
+        <w:tblLayout w:type="fixed"/>
+        <w:tblLook w:firstColumn="1" w:firstRow="1" w:lastColumn="0" w:lastRow="0" w:noHBand="0" w:noVBand="1" w:val="04A0"/>
+      </w:tblPr>
+      <w:tblGrid>
+        <w:gridCol w:w="850"/>
+        <w:gridCol w:w="3628"/>
+        <w:gridCol w:w="907"/>
+        <w:gridCol w:w="1361"/>
+        <w:gridCol w:w="1361"/>
+        <w:gridCol w:w="1361"/>
+      </w:tblGrid>
+      <w:tr>
+        <w:trPr>
+          <w:cantSplit/>
+        </w:trPr>
+        <w:tc>
+          <w:tcPr>
+            <w:tcW w:type="dxa" w:w="850"/>
+            <w:shd w:val="clear" w:color="auto" w:fill="D9E1F2"/>
+          </w:tcPr>
+          <w:p>
+            <w:pPr>
+              <w:keepNext/>
+              <w:jc w:val="center"/>
+            </w:pPr>
+            <w:r/>
+            <w:r>
+              <w:rPr>
+                <w:b/>
+                <w:sz w:val="20"/>
+              </w:rPr>
+              <w:t>№ по КП</w:t>
+            </w:r>
+          </w:p>
+        </w:tc>
+        <w:tc>
+          <w:tcPr>
+            <w:tcW w:type="dxa" w:w="3628"/>
+            <w:shd w:val="clear" w:color="auto" w:fill="D9E1F2"/>
+          </w:tcPr>
+          <w:p>
+            <w:pPr>
+              <w:keepNext/>
+              <w:jc w:val="center"/>
+            </w:pPr>
+            <w:r/>
+            <w:r>
+              <w:rPr>
+                <w:b/>
+                <w:sz w:val="20"/>
+              </w:rPr>
+              <w:t>Позиция</w:t>
+            </w:r>
+          </w:p>
+        </w:tc>
+        <w:tc>
+          <w:tcPr>
+            <w:tcW w:type="dxa" w:w="907"/>
+            <w:shd w:val="clear" w:color="auto" w:fill="D9E1F2"/>
+          </w:tcPr>
+          <w:p>
+            <w:pPr>
+              <w:keepNext/>
+              <w:jc w:val="center"/>
+            </w:pPr>
+            <w:r/>
+            <w:r>
+              <w:rPr>
+                <w:b/>
+                <w:sz w:val="20"/>
+              </w:rPr>
+              <w:t>Кол-во</w:t>
+            </w:r>
+          </w:p>
+        </w:tc>
+        <w:tc>
+          <w:tcPr>
+            <w:tcW w:type="dxa" w:w="1361"/>
+            <w:shd w:val="clear" w:color="auto" w:fill="D9E1F2"/>
+          </w:tcPr>
+          <w:p>
+            <w:pPr>
+              <w:keepNext/>
+              <w:jc w:val="center"/>
+            </w:pPr>
+            <w:r/>
+            <w:r>
+              <w:rPr>
+                <w:b/>
+                <w:sz w:val="20"/>
+              </w:rPr>
+              <w:t>Наша цена, ₽</w:t>
+            </w:r>
+          </w:p>
+        </w:tc>
+        <w:tc>
+          <w:tcPr>
+            <w:tcW w:type="dxa" w:w="1361"/>
+            <w:shd w:val="clear" w:color="auto" w:fill="D9E1F2"/>
+          </w:tcPr>
+          <w:p>
+            <w:pPr>
+              <w:keepNext/>
+              <w:jc w:val="center"/>
+            </w:pPr>
+            <w:r/>
+            <w:r>
+              <w:rPr>
+                <w:b/>
+                <w:sz w:val="20"/>
+              </w:rPr>
+              <w:t>Предложено, ₽</w:t>
+            </w:r>
+          </w:p>
+        </w:tc>
+        <w:tc>
+          <w:tcPr>
+            <w:tcW w:type="dxa" w:w="1361"/>
+            <w:shd w:val="clear" w:color="auto" w:fill="D9E1F2"/>
+          </w:tcPr>
+          <w:p>
+            <w:pPr>
+              <w:keepNext/>
+              <w:jc w:val="center"/>
+            </w:pPr>
+            <w:r/>
+            <w:r>
+              <w:rPr>
+                <w:b/>
+                <w:sz w:val="20"/>
+              </w:rPr>
+              <w:t>Разница, ₽</w:t>
+            </w:r>
+          </w:p>
+        </w:tc>
+      </w:tr>
+      <w:tr>
+        <w:trPr>
+          <w:cantSplit/>
+        </w:trPr>
+        <w:tc>
+          <w:tcPr>
+            <w:tcW w:type="dxa" w:w="850"/>
+          </w:tcPr>
+          <w:p>
+            <w:pPr>
+              <w:keepNext/>
+              <w:spacing w:after="0"/>
+            </w:pPr>
+            <w:r>
+              <w:rPr>
+                <w:b w:val="0"/>
+                <w:sz w:val="20"/>
+              </w:rPr>
+              <w:t>3.13</w:t>
+            </w:r>
+          </w:p>
+        </w:tc>
+        <w:tc>
+          <w:tcPr>
+            <w:tcW w:type="dxa" w:w="3628"/>
+          </w:tcPr>
+          <w:p>
+            <w:pPr>
+              <w:keepNext/>
+              <w:spacing w:after="0"/>
+            </w:pPr>
+            <w:r>
+              <w:rPr>
+                <w:b w:val="0"/>
+                <w:sz w:val="20"/>
+              </w:rPr>
+              <w:t>Перемонтаж щелевых диффузоров</w:t>
+            </w:r>
+          </w:p>
+        </w:tc>
+        <w:tc>
+          <w:tcPr>
+            <w:tcW w:type="dxa" w:w="907"/>
+          </w:tcPr>
+          <w:p>
+            <w:pPr>
+              <w:keepNext/>
+              <w:spacing w:after="0"/>
+            </w:pPr>
+            <w:r>
+              <w:rPr>
+                <w:b w:val="0"/>
+                <w:sz w:val="20"/>
+              </w:rPr>
+              <w:t>8 к-т</w:t>
+            </w:r>
+          </w:p>
+        </w:tc>
+        <w:tc>
+          <w:tcPr>
+            <w:tcW w:type="dxa" w:w="1361"/>
+          </w:tcPr>
+          <w:p>
+            <w:pPr>
+              <w:keepNext/>
+              <w:spacing w:after="0"/>
+              <w:jc w:val="right"/>
+            </w:pPr>
+            <w:r>
+              <w:rPr>
+                <w:b w:val="0"/>
+                <w:sz w:val="20"/>
+              </w:rPr>
+              <w:t>16 800</w:t>
+            </w:r>
+          </w:p>
+        </w:tc>
+        <w:tc>
+          <w:tcPr>
+            <w:tcW w:type="dxa" w:w="1361"/>
+          </w:tcPr>
+          <w:p>
+            <w:pPr>
+              <w:keepNext/>
+              <w:spacing w:after="0"/>
+              <w:jc w:val="right"/>
+            </w:pPr>
+            <w:r>
+              <w:rPr>
+                <w:b w:val="0"/>
+                <w:sz w:val="20"/>
+              </w:rPr>
+              <w:t>4 800</w:t>
+            </w:r>
+          </w:p>
+        </w:tc>
+        <w:tc>
+          <w:tcPr>
+            <w:tcW w:type="dxa" w:w="1361"/>
+          </w:tcPr>
+          <w:p>
+            <w:pPr>
+              <w:keepNext/>
+              <w:spacing w:after="0"/>
+              <w:jc w:val="right"/>
+            </w:pPr>
+            <w:r>
+              <w:rPr>
+                <w:b w:val="0"/>
+                <w:sz w:val="20"/>
+              </w:rPr>
+              <w:t>96 000</w:t>
+            </w:r>
+          </w:p>
+        </w:tc>
+      </w:tr>
+      <w:tr>
+        <w:trPr>
+          <w:cantSplit/>
+        </w:trPr>
+        <w:tc>
+          <w:tcPr>
+            <w:tcW w:type="dxa" w:w="850"/>
+          </w:tcPr>
+          <w:p>
+            <w:pPr>
+              <w:keepNext/>
+              <w:spacing w:after="0"/>
+            </w:pPr>
+            <w:r>
+              <w:rPr>
+                <w:b w:val="0"/>
+                <w:sz w:val="20"/>
+              </w:rPr>
+              <w:t>3.9</w:t>
+            </w:r>
+          </w:p>
+        </w:tc>
+        <w:tc>
+          <w:tcPr>
+            <w:tcW w:type="dxa" w:w="3628"/>
+          </w:tcPr>
+          <w:p>
+            <w:pPr>
+              <w:keepNext/>
+              <w:spacing w:after="0"/>
+            </w:pPr>
+            <w:r>
+              <w:rPr>
+                <w:b w:val="0"/>
+                <w:sz w:val="20"/>
+              </w:rPr>
+              <w:t>Монтаж пожарного клапана</w:t>
+            </w:r>
+          </w:p>
+        </w:tc>
+        <w:tc>
+          <w:tcPr>
+            <w:tcW w:type="dxa" w:w="907"/>
+          </w:tcPr>
+          <w:p>
+            <w:pPr>
+              <w:keepNext/>
+              <w:spacing w:after="0"/>
+            </w:pPr>
+            <w:r>
+              <w:rPr>
+                <w:b w:val="0"/>
+                <w:sz w:val="20"/>
+              </w:rPr>
+              <w:t>4 к-т (у Вас 2)</w:t>
+            </w:r>
+          </w:p>
+        </w:tc>
+        <w:tc>
+          <w:tcPr>
+            <w:tcW w:type="dxa" w:w="1361"/>
+          </w:tcPr>
+          <w:p>
+            <w:pPr>
+              <w:keepNext/>
+              <w:spacing w:after="0"/>
+              <w:jc w:val="right"/>
+            </w:pPr>
+            <w:r>
+              <w:rPr>
+                <w:b w:val="0"/>
+                <w:sz w:val="20"/>
+              </w:rPr>
+              <w:t>21 000</w:t>
+            </w:r>
+          </w:p>
+        </w:tc>
+        <w:tc>
+          <w:tcPr>
+            <w:tcW w:type="dxa" w:w="1361"/>
+          </w:tcPr>
+          <w:p>
+            <w:pPr>
+              <w:keepNext/>
+              <w:spacing w:after="0"/>
+              <w:jc w:val="right"/>
+            </w:pPr>
+            <w:r>
+              <w:rPr>
+                <w:b w:val="0"/>
+                <w:sz w:val="20"/>
+              </w:rPr>
+              <w:t>2 900</w:t>
+            </w:r>
+          </w:p>
+        </w:tc>
+        <w:tc>
+          <w:tcPr>
+            <w:tcW w:type="dxa" w:w="1361"/>
+          </w:tcPr>
+          <w:p>
+            <w:pPr>
+              <w:keepNext/>
+              <w:spacing w:after="0"/>
+              <w:jc w:val="right"/>
+            </w:pPr>
+            <w:r>
+              <w:rPr>
+                <w:b w:val="0"/>
+                <w:sz w:val="20"/>
+              </w:rPr>
+              <w:t>78 200</w:t>
+            </w:r>
+          </w:p>
+        </w:tc>
+      </w:tr>
+      <w:tr>
+        <w:trPr>
+          <w:cantSplit/>
+        </w:trPr>
+        <w:tc>
+          <w:tcPr>
+            <w:tcW w:type="dxa" w:w="850"/>
+          </w:tcPr>
+          <w:p>
+            <w:pPr>
+              <w:keepNext/>
+              <w:spacing w:after="0"/>
+            </w:pPr>
+            <w:r>
+              <w:rPr>
+                <w:b w:val="0"/>
+                <w:sz w:val="20"/>
+              </w:rPr>
+              <w:t>3.15</w:t>
+            </w:r>
+          </w:p>
+        </w:tc>
+        <w:tc>
+          <w:tcPr>
+            <w:tcW w:type="dxa" w:w="3628"/>
+          </w:tcPr>
+          <w:p>
+            <w:pPr>
+              <w:keepNext/>
+              <w:spacing w:after="0"/>
+            </w:pPr>
+            <w:r>
+              <w:rPr>
+                <w:b w:val="0"/>
+                <w:sz w:val="20"/>
+              </w:rPr>
+              <w:t>Демонтаж диффузора, гибкая подводка, монтаж диффузора в ГКЛ</w:t>
+            </w:r>
+          </w:p>
+        </w:tc>
+        <w:tc>
+          <w:tcPr>
+            <w:tcW w:type="dxa" w:w="907"/>
+          </w:tcPr>
+          <w:p>
+            <w:pPr>
+              <w:keepNext/>
+              <w:spacing w:after="0"/>
+            </w:pPr>
+            <w:r>
+              <w:rPr>
+                <w:b w:val="0"/>
+                <w:sz w:val="20"/>
+              </w:rPr>
+              <w:t>6 к-т</w:t>
+            </w:r>
+          </w:p>
+        </w:tc>
+        <w:tc>
+          <w:tcPr>
+            <w:tcW w:type="dxa" w:w="1361"/>
+          </w:tcPr>
+          <w:p>
+            <w:pPr>
+              <w:keepNext/>
+              <w:spacing w:after="0"/>
+              <w:jc w:val="right"/>
+            </w:pPr>
+            <w:r>
+              <w:rPr>
+                <w:b w:val="0"/>
+                <w:sz w:val="20"/>
+              </w:rPr>
+              <w:t>4 200</w:t>
+            </w:r>
+          </w:p>
+        </w:tc>
+        <w:tc>
+          <w:tcPr>
+            <w:tcW w:type="dxa" w:w="1361"/>
+          </w:tcPr>
+          <w:p>
+            <w:pPr>
+              <w:keepNext/>
+              <w:spacing w:after="0"/>
+              <w:jc w:val="right"/>
+            </w:pPr>
+            <w:r>
+              <w:rPr>
+                <w:b w:val="0"/>
+                <w:sz w:val="20"/>
+              </w:rPr>
+              <w:t>1 500</w:t>
+            </w:r>
+          </w:p>
+        </w:tc>
+        <w:tc>
+          <w:tcPr>
+            <w:tcW w:type="dxa" w:w="1361"/>
+          </w:tcPr>
+          <w:p>
+            <w:pPr>
+              <w:keepNext/>
+              <w:spacing w:after="0"/>
+              <w:jc w:val="right"/>
+            </w:pPr>
+            <w:r>
+              <w:rPr>
+                <w:b w:val="0"/>
+                <w:sz w:val="20"/>
+              </w:rPr>
+              <w:t>16 200</w:t>
+            </w:r>
+          </w:p>
+        </w:tc>
+      </w:tr>
+      <w:tr>
+        <w:trPr>
+          <w:cantSplit/>
+        </w:trPr>
+        <w:tc>
+          <w:tcPr>
+            <w:tcW w:type="dxa" w:w="850"/>
+          </w:tcPr>
+          <w:p>
+            <w:pPr>
+              <w:keepNext/>
+              <w:spacing w:after="0"/>
+            </w:pPr>
+            <w:r>
+              <w:rPr>
+                <w:b w:val="0"/>
+                <w:sz w:val="20"/>
+              </w:rPr>
+              <w:t>3.19</w:t>
+            </w:r>
+          </w:p>
+        </w:tc>
+        <w:tc>
+          <w:tcPr>
+            <w:tcW w:type="dxa" w:w="3628"/>
+          </w:tcPr>
+          <w:p>
+            <w:pPr>
+              <w:keepNext/>
+              <w:spacing w:after="0"/>
+            </w:pPr>
+            <w:r>
+              <w:rPr>
+                <w:b w:val="0"/>
+                <w:sz w:val="20"/>
+              </w:rPr>
+              <w:t>Демонтаж короба щелевой решётки</w:t>
+            </w:r>
+          </w:p>
+        </w:tc>
+        <w:tc>
+          <w:tcPr>
+            <w:tcW w:type="dxa" w:w="907"/>
+          </w:tcPr>
+          <w:p>
+            <w:pPr>
+              <w:keepNext/>
+              <w:spacing w:after="0"/>
+            </w:pPr>
+            <w:r>
+              <w:rPr>
+                <w:b w:val="0"/>
+                <w:sz w:val="20"/>
+              </w:rPr>
+              <w:t>8 шт.</w:t>
+            </w:r>
+          </w:p>
+        </w:tc>
+        <w:tc>
+          <w:tcPr>
+            <w:tcW w:type="dxa" w:w="1361"/>
+          </w:tcPr>
+          <w:p>
+            <w:pPr>
+              <w:keepNext/>
+              <w:spacing w:after="0"/>
+              <w:jc w:val="right"/>
+            </w:pPr>
+            <w:r>
+              <w:rPr>
+                <w:b w:val="0"/>
+                <w:sz w:val="20"/>
+              </w:rPr>
+              <w:t>4 200</w:t>
+            </w:r>
+          </w:p>
+        </w:tc>
+        <w:tc>
+          <w:tcPr>
+            <w:tcW w:type="dxa" w:w="1361"/>
+          </w:tcPr>
+          <w:p>
+            <w:pPr>
+              <w:keepNext/>
+              <w:spacing w:after="0"/>
+              <w:jc w:val="right"/>
+            </w:pPr>
+            <w:r>
+              <w:rPr>
+                <w:b w:val="0"/>
+                <w:sz w:val="20"/>
+              </w:rPr>
+              <w:t>2 400</w:t>
+            </w:r>
+          </w:p>
+        </w:tc>
+        <w:tc>
+          <w:tcPr>
+            <w:tcW w:type="dxa" w:w="1361"/>
+          </w:tcPr>
+          <w:p>
+            <w:pPr>
+              <w:keepNext/>
+              <w:spacing w:after="0"/>
+              <w:jc w:val="right"/>
+            </w:pPr>
+            <w:r>
+              <w:rPr>
+                <w:b w:val="0"/>
+                <w:sz w:val="20"/>
+              </w:rPr>
+              <w:t>14 400</w:t>
+            </w:r>
+          </w:p>
+        </w:tc>
+      </w:tr>
+      <w:tr>
+        <w:trPr>
+          <w:cantSplit/>
+        </w:trPr>
+        <w:tc>
+          <w:tcPr>
+            <w:tcW w:type="dxa" w:w="850"/>
+          </w:tcPr>
+          <w:p>
+            <w:pPr>
+              <w:spacing w:after="0"/>
+            </w:pPr>
+            <w:r>
+              <w:rPr>
+                <w:b/>
+                <w:sz w:val="20"/>
+              </w:rPr>
+            </w:r>
+          </w:p>
+        </w:tc>
+        <w:tc>
+          <w:tcPr>
+            <w:tcW w:type="dxa" w:w="3628"/>
+          </w:tcPr>
+          <w:p>
+            <w:pPr>
+              <w:spacing w:after="0"/>
+            </w:pPr>
+            <w:r>
+              <w:rPr>
+                <w:b/>
+                <w:sz w:val="20"/>
+              </w:rPr>
+              <w:t>Итого</w:t>
+            </w:r>
+          </w:p>
+        </w:tc>
+        <w:tc>
+          <w:tcPr>
+            <w:tcW w:type="dxa" w:w="907"/>
+          </w:tcPr>
+          <w:p>
+            <w:pPr>
+              <w:spacing w:after="0"/>
+            </w:pPr>
+            <w:r>
+              <w:rPr>
+                <w:b/>
+                <w:sz w:val="20"/>
+              </w:rPr>
+            </w:r>
+          </w:p>
+        </w:tc>
+        <w:tc>
+          <w:tcPr>
+            <w:tcW w:type="dxa" w:w="1361"/>
+          </w:tcPr>
+          <w:p>
+            <w:pPr>
+              <w:spacing w:after="0"/>
+              <w:jc w:val="right"/>
+            </w:pPr>
+            <w:r>
+              <w:rPr>
+                <w:b/>
+                <w:sz w:val="20"/>
+              </w:rPr>
+            </w:r>
+          </w:p>
+        </w:tc>
+        <w:tc>
+          <w:tcPr>
+            <w:tcW w:type="dxa" w:w="1361"/>
+          </w:tcPr>
+          <w:p>
+            <w:pPr>
+              <w:spacing w:after="0"/>
+              <w:jc w:val="right"/>
+            </w:pPr>
+            <w:r>
+              <w:rPr>
+                <w:b/>
+                <w:sz w:val="20"/>
+              </w:rPr>
+            </w:r>
+          </w:p>
+        </w:tc>
+        <w:tc>
+          <w:tcPr>
+            <w:tcW w:type="dxa" w:w="1361"/>
+          </w:tcPr>
+          <w:p>
+            <w:pPr>
+              <w:spacing w:after="0"/>
+              <w:jc w:val="right"/>
+            </w:pPr>
+            <w:r>
+              <w:rPr>
+                <w:b/>
+                <w:sz w:val="20"/>
+              </w:rPr>
+              <w:t>204 800</w:t>
+            </w:r>
+          </w:p>
+        </w:tc>
+      </w:tr>
+    </w:tbl>
+    <w:p>
+      <w:pPr>
+        <w:spacing w:after="0"/>
+      </w:pPr>
+    </w:p>
+    <w:p>
+      <w:pPr>
+        <w:pStyle w:val="ListBullet"/>
+        <w:jc w:val="both"/>
+      </w:pPr>
+      <w:r>
+        <w:rPr>
+          <w:b/>
+        </w:rPr>
+        <w:t>3.13. Перемонтаж щелевых диффузоров.</w:t>
+      </w:r>
+      <w:r>
+        <w:rPr>
+          <w:b w:val="0"/>
+        </w:rPr>
+        <w:t xml:space="preserve"> Это две операции: демонтаж диффузора из смонтированного потолка и повторный монтаж с подключением и регулировкой. Предложенные 4 800 ₽ — это фактически цена одного монтажа щелевой решётки (4 000 ₽, п. 1.4 Приложения № 1 к ДС № 1), без демонтажа и работы в готовом потолке.</w:t>
+      </w:r>
+    </w:p>
+    <w:p>
+      <w:pPr>
+        <w:pStyle w:val="ListBullet"/>
+        <w:jc w:val="both"/>
+      </w:pPr>
+      <w:r>
+        <w:rPr>
+          <w:b/>
+        </w:rPr>
+        <w:t>3.9. Монтаж пожарного клапана.</w:t>
+      </w:r>
+      <w:r>
+        <w:rPr>
+          <w:b w:val="0"/>
+        </w:rPr>
+        <w:t xml:space="preserve"> Работа включает демонтаж участка существующего воздуховода, установку клапана и восстановление сети с герметизацией. По нашему КП клапаны установлены на 4 этажах (3, 7, 8, 9), а не на 2. Просим сверить количество по факту.</w:t>
+      </w:r>
+    </w:p>
+    <w:p>
+      <w:pPr>
+        <w:pStyle w:val="ListBullet"/>
+        <w:jc w:val="both"/>
+      </w:pPr>
+      <w:r>
+        <w:rPr>
+          <w:b/>
+        </w:rPr>
+        <w:t>3.15. Демонтаж диффузора и монтаж в ГКЛ.</w:t>
+      </w:r>
+      <w:r>
+        <w:rPr>
+          <w:b w:val="0"/>
+        </w:rPr>
+        <w:t xml:space="preserve"> Три операции в два приёма: демонтаж существующего диффузора, временная гибкая подводка, а после зашивки потолка — повторный монтаж диффузора в ГКЛ.</w:t>
+      </w:r>
+    </w:p>
+    <w:p>
+      <w:pPr>
+        <w:pStyle w:val="ListBullet"/>
+        <w:jc w:val="both"/>
+      </w:pPr>
+      <w:r>
+        <w:rPr>
+          <w:b/>
+        </w:rPr>
+        <w:t>3.19. Демонтаж короба щелевой решётки.</w:t>
+      </w:r>
+      <w:r>
+        <w:rPr>
+          <w:b w:val="0"/>
+        </w:rPr>
+        <w:t xml:space="preserve"> Щелевой диффузор извлекается из металлической потолочной плитки Armstrong. Это аккуратная работа с уже смонтированным потолком без его повреждения.</w:t>
+      </w:r>
+    </w:p>
+    <w:p>
+      <w:pPr>
+        <w:ind w:firstLine="709"/>
+        <w:jc w:val="both"/>
+      </w:pPr>
+      <w:r>
+        <w:rPr>
+          <w:b/>
+        </w:rPr>
+        <w:t>Просим:</w:t>
+      </w:r>
+      <w:r>
+        <w:rPr>
+          <w:b w:val="0"/>
+        </w:rPr>
+        <w:t xml:space="preserve"> сохранить расценки нашего КП по п. 3.9, 3.13, 3.15 и 3.19.</w:t>
+      </w:r>
+    </w:p>
+    <w:p>
+      <w:pPr>
+        <w:keepNext/>
+        <w:spacing w:before="240" w:after="120"/>
+      </w:pPr>
+      <w:r>
+        <w:rPr>
+          <w:b/>
+          <w:sz w:val="24"/>
+        </w:rPr>
+        <w:t>7. Новые работы: цены ниже договорных на те же изделия — 94 031,18 ₽</w:t>
       </w:r>
     </w:p>
     <w:p>
@@ -1484,7 +4293,7 @@
         <w:rPr>
           <w:b/>
         </w:rPr>
-        <w:t>3.1. Решётка защитная круглая Ø100 / Ø160 / Ø200, 2 этаж (п. 6.1–6.3).</w:t>
+        <w:t>7.1. Решётка защитная круглая Ø100 / Ø160 / Ø200, 2 этаж (п. 6.1–6.3).</w:t>
       </w:r>
       <w:r>
         <w:rPr>
@@ -1502,7 +4311,7 @@
         <w:rPr>
           <w:b/>
         </w:rPr>
-        <w:t>3.2. Ниппели из оцинкованной стали, 10 и 2 этаж (п. 4.76–4.79, 6.65–6.68).</w:t>
+        <w:t>7.2. Ниппели из оцинкованной стали, 10 и 2 этаж (п. 4.76–4.79, 6.65–6.68).</w:t>
       </w:r>
       <w:r>
         <w:rPr>
@@ -1520,25 +4329,7 @@
         <w:rPr>
           <w:b/>
         </w:rPr>
-        <w:t>3.3. Изоляция прямоугольных и круглых воздуховодов, 10 этаж (п. 4.82–4.83).</w:t>
-      </w:r>
-      <w:r>
-        <w:rPr>
-          <w:b w:val="0"/>
-        </w:rPr>
-        <w:t xml:space="preserve"> Предложено 665 ₽. На 2 этаже та же работа (п. 6.72–6.73) принята по 800 ₽. Просим 800 ₽.</w:t>
-      </w:r>
-    </w:p>
-    <w:p>
-      <w:pPr>
-        <w:ind w:firstLine="709"/>
-        <w:jc w:val="both"/>
-      </w:pPr>
-      <w:r>
-        <w:rPr>
-          <w:b/>
-        </w:rPr>
-        <w:t>3.4. Врезки, врезки-сёдла, тройник и переходы круглые 0,5 мм, 10 этаж (п. 4.56–4.66).</w:t>
+        <w:t>7.3. Врезки, врезки-сёдла, тройник и переходы круглые 0,5 мм, 10 этаж (п. 4.56–4.66).</w:t>
       </w:r>
       <w:r>
         <w:rPr>
@@ -1556,7 +4347,7 @@
         <w:rPr>
           <w:b/>
         </w:rPr>
-        <w:t>3.5. Отвод 15° Ø200, 2 этаж (п. 6.25).</w:t>
+        <w:t>7.4. Отвод 15° Ø200, 2 этаж (п. 6.25).</w:t>
       </w:r>
       <w:r>
         <w:rPr>
@@ -1574,7 +4365,7 @@
         <w:rPr>
           <w:b/>
         </w:rPr>
-        <w:t>3.6. Заглушка прямоугольная 400×200, 2 этаж (п. 6.64).</w:t>
+        <w:t>7.5. Заглушка прямоугольная 400×200, 2 этаж (п. 6.64).</w:t>
       </w:r>
       <w:r>
         <w:rPr>
@@ -1593,7 +4384,7 @@
           <w:b/>
           <w:sz w:val="24"/>
         </w:rPr>
-        <w:t>4. Дымоудаление — 1 028 480 ₽ в отдельное допсоглашение</w:t>
+        <w:t>8. Дымоудаление — 1 028 480 ₽ в отдельное допсоглашение</w:t>
       </w:r>
     </w:p>
     <w:p>
@@ -1636,11 +4427,12 @@
           <w:b/>
           <w:sz w:val="24"/>
         </w:rPr>
-        <w:t>5. Сводка возражений</w:t>
+        <w:t>9. Сводка возражений</w:t>
       </w:r>
     </w:p>
     <w:p>
       <w:pPr>
+        <w:keepNext/>
         <w:ind w:firstLine="709"/>
         <w:jc w:val="both"/>
       </w:pPr>
@@ -1648,7 +4440,7 @@
         <w:rPr>
           <w:b w:val="0"/>
         </w:rPr>
-        <w:t>Просим вернуть в КП 2 768 111,16 ₽ по разделам 1–3, из них 1 495 574,98 ₽ — цены, уже подписанные в ДС № 1. Ещё 1 028 480 ₽ по дымоудалению уходят в отдельное допсоглашение.</w:t>
+        <w:t>Просим вернуть в КП 4 230 361,16 ₽ по разделам 1, 2 и 4–7, из них 1 495 574,98 ₽ — цены, уже подписанные в ДС № 1. Ещё 1 028 480 ₽ по дымоудалению уходят в отдельное допсоглашение.</w:t>
       </w:r>
     </w:p>
     <w:tbl>
@@ -1667,6 +4459,9 @@
         <w:gridCol w:w="1531"/>
       </w:tblGrid>
       <w:tr>
+        <w:trPr>
+          <w:cantSplit/>
+        </w:trPr>
         <w:tc>
           <w:tcPr>
             <w:tcW w:type="dxa" w:w="2835"/>
@@ -1674,6 +4469,7 @@
           </w:tcPr>
           <w:p>
             <w:pPr>
+              <w:keepNext/>
               <w:jc w:val="center"/>
             </w:pPr>
             <w:r/>
@@ -1693,6 +4489,7 @@
           </w:tcPr>
           <w:p>
             <w:pPr>
+              <w:keepNext/>
               <w:jc w:val="center"/>
             </w:pPr>
             <w:r/>
@@ -1712,6 +4509,7 @@
           </w:tcPr>
           <w:p>
             <w:pPr>
+              <w:keepNext/>
               <w:jc w:val="center"/>
             </w:pPr>
             <w:r/>
@@ -1731,6 +4529,7 @@
           </w:tcPr>
           <w:p>
             <w:pPr>
+              <w:keepNext/>
               <w:jc w:val="center"/>
             </w:pPr>
             <w:r/>
@@ -1750,6 +4549,7 @@
           </w:tcPr>
           <w:p>
             <w:pPr>
+              <w:keepNext/>
               <w:jc w:val="center"/>
             </w:pPr>
             <w:r/>
@@ -1764,12 +4564,16 @@
         </w:tc>
       </w:tr>
       <w:tr>
+        <w:trPr>
+          <w:cantSplit/>
+        </w:trPr>
         <w:tc>
           <w:tcPr>
             <w:tcW w:type="dxa" w:w="2835"/>
           </w:tcPr>
           <w:p>
             <w:pPr>
+              <w:keepNext/>
               <w:spacing w:after="0"/>
             </w:pPr>
             <w:r>
@@ -1787,6 +4591,7 @@
           </w:tcPr>
           <w:p>
             <w:pPr>
+              <w:keepNext/>
               <w:spacing w:after="0"/>
             </w:pPr>
             <w:r>
@@ -1804,6 +4609,7 @@
           </w:tcPr>
           <w:p>
             <w:pPr>
+              <w:keepNext/>
               <w:spacing w:after="0"/>
             </w:pPr>
             <w:r>
@@ -1821,6 +4627,7 @@
           </w:tcPr>
           <w:p>
             <w:pPr>
+              <w:keepNext/>
               <w:spacing w:after="0"/>
             </w:pPr>
             <w:r>
@@ -1838,6 +4645,7 @@
           </w:tcPr>
           <w:p>
             <w:pPr>
+              <w:keepNext/>
               <w:spacing w:after="0"/>
               <w:jc w:val="right"/>
             </w:pPr>
@@ -1852,12 +4660,16 @@
         </w:tc>
       </w:tr>
       <w:tr>
+        <w:trPr>
+          <w:cantSplit/>
+        </w:trPr>
         <w:tc>
           <w:tcPr>
             <w:tcW w:type="dxa" w:w="2835"/>
           </w:tcPr>
           <w:p>
             <w:pPr>
+              <w:keepNext/>
               <w:spacing w:after="0"/>
             </w:pPr>
             <w:r>
@@ -1875,6 +4687,7 @@
           </w:tcPr>
           <w:p>
             <w:pPr>
+              <w:keepNext/>
               <w:spacing w:after="0"/>
             </w:pPr>
             <w:r>
@@ -1892,6 +4705,7 @@
           </w:tcPr>
           <w:p>
             <w:pPr>
+              <w:keepNext/>
               <w:spacing w:after="0"/>
             </w:pPr>
             <w:r>
@@ -1909,6 +4723,7 @@
           </w:tcPr>
           <w:p>
             <w:pPr>
+              <w:keepNext/>
               <w:spacing w:after="0"/>
             </w:pPr>
             <w:r>
@@ -1926,6 +4741,7 @@
           </w:tcPr>
           <w:p>
             <w:pPr>
+              <w:keepNext/>
               <w:spacing w:after="0"/>
               <w:jc w:val="right"/>
             </w:pPr>
@@ -1940,12 +4756,16 @@
         </w:tc>
       </w:tr>
       <w:tr>
+        <w:trPr>
+          <w:cantSplit/>
+        </w:trPr>
         <w:tc>
           <w:tcPr>
             <w:tcW w:type="dxa" w:w="2835"/>
           </w:tcPr>
           <w:p>
             <w:pPr>
+              <w:keepNext/>
               <w:spacing w:after="0"/>
             </w:pPr>
             <w:r>
@@ -1953,7 +4773,7 @@
                 <w:b w:val="0"/>
                 <w:sz w:val="20"/>
               </w:rPr>
-              <w:t>3.1. Решётки защитные</w:t>
+              <w:t>4. Фанкойлы</w:t>
             </w:r>
           </w:p>
         </w:tc>
@@ -1963,6 +4783,295 @@
           </w:tcPr>
           <w:p>
             <w:pPr>
+              <w:keepNext/>
+              <w:spacing w:after="0"/>
+            </w:pPr>
+            <w:r>
+              <w:rPr>
+                <w:b w:val="0"/>
+                <w:sz w:val="20"/>
+              </w:rPr>
+              <w:t>5.1, 7.1</w:t>
+            </w:r>
+          </w:p>
+        </w:tc>
+        <w:tc>
+          <w:tcPr>
+            <w:tcW w:type="dxa" w:w="1644"/>
+          </w:tcPr>
+          <w:p>
+            <w:pPr>
+              <w:keepNext/>
+              <w:spacing w:after="0"/>
+            </w:pPr>
+            <w:r>
+              <w:rPr>
+                <w:b w:val="0"/>
+                <w:sz w:val="20"/>
+              </w:rPr>
+              <w:t>14 000</w:t>
+            </w:r>
+          </w:p>
+        </w:tc>
+        <w:tc>
+          <w:tcPr>
+            <w:tcW w:type="dxa" w:w="1814"/>
+          </w:tcPr>
+          <w:p>
+            <w:pPr>
+              <w:keepNext/>
+              <w:spacing w:after="0"/>
+            </w:pPr>
+            <w:r>
+              <w:rPr>
+                <w:b w:val="0"/>
+                <w:sz w:val="20"/>
+              </w:rPr>
+              <w:t>25 920 / 29 160</w:t>
+            </w:r>
+          </w:p>
+        </w:tc>
+        <w:tc>
+          <w:tcPr>
+            <w:tcW w:type="dxa" w:w="1531"/>
+          </w:tcPr>
+          <w:p>
+            <w:pPr>
+              <w:keepNext/>
+              <w:spacing w:after="0"/>
+              <w:jc w:val="right"/>
+            </w:pPr>
+            <w:r>
+              <w:rPr>
+                <w:b w:val="0"/>
+                <w:sz w:val="20"/>
+              </w:rPr>
+              <w:t>589 160,00</w:t>
+            </w:r>
+          </w:p>
+        </w:tc>
+      </w:tr>
+      <w:tr>
+        <w:trPr>
+          <w:cantSplit/>
+        </w:trPr>
+        <w:tc>
+          <w:tcPr>
+            <w:tcW w:type="dxa" w:w="2835"/>
+          </w:tcPr>
+          <w:p>
+            <w:pPr>
+              <w:keepNext/>
+              <w:spacing w:after="0"/>
+            </w:pPr>
+            <w:r>
+              <w:rPr>
+                <w:b w:val="0"/>
+                <w:sz w:val="20"/>
+              </w:rPr>
+              <w:t>5. Изоляция</w:t>
+            </w:r>
+          </w:p>
+        </w:tc>
+        <w:tc>
+          <w:tcPr>
+            <w:tcW w:type="dxa" w:w="1928"/>
+          </w:tcPr>
+          <w:p>
+            <w:pPr>
+              <w:keepNext/>
+              <w:spacing w:after="0"/>
+            </w:pPr>
+            <w:r>
+              <w:rPr>
+                <w:b w:val="0"/>
+                <w:sz w:val="20"/>
+              </w:rPr>
+              <w:t>3.7, 4.80–4.83, 6.72–6.73</w:t>
+            </w:r>
+          </w:p>
+        </w:tc>
+        <w:tc>
+          <w:tcPr>
+            <w:tcW w:type="dxa" w:w="1644"/>
+          </w:tcPr>
+          <w:p>
+            <w:pPr>
+              <w:keepNext/>
+              <w:spacing w:after="0"/>
+            </w:pPr>
+            <w:r>
+              <w:rPr>
+                <w:b w:val="0"/>
+                <w:sz w:val="20"/>
+              </w:rPr>
+              <w:t>450–800</w:t>
+            </w:r>
+          </w:p>
+        </w:tc>
+        <w:tc>
+          <w:tcPr>
+            <w:tcW w:type="dxa" w:w="1814"/>
+          </w:tcPr>
+          <w:p>
+            <w:pPr>
+              <w:keepNext/>
+              <w:spacing w:after="0"/>
+            </w:pPr>
+            <w:r>
+              <w:rPr>
+                <w:b w:val="0"/>
+                <w:sz w:val="20"/>
+              </w:rPr>
+              <w:t>840–3 240</w:t>
+            </w:r>
+          </w:p>
+        </w:tc>
+        <w:tc>
+          <w:tcPr>
+            <w:tcW w:type="dxa" w:w="1531"/>
+          </w:tcPr>
+          <w:p>
+            <w:pPr>
+              <w:keepNext/>
+              <w:spacing w:after="0"/>
+              <w:jc w:val="right"/>
+            </w:pPr>
+            <w:r>
+              <w:rPr>
+                <w:b w:val="0"/>
+                <w:sz w:val="20"/>
+              </w:rPr>
+              <w:t>695 425,00</w:t>
+            </w:r>
+          </w:p>
+        </w:tc>
+      </w:tr>
+      <w:tr>
+        <w:trPr>
+          <w:cantSplit/>
+        </w:trPr>
+        <w:tc>
+          <w:tcPr>
+            <w:tcW w:type="dxa" w:w="2835"/>
+          </w:tcPr>
+          <w:p>
+            <w:pPr>
+              <w:keepNext/>
+              <w:spacing w:after="0"/>
+            </w:pPr>
+            <w:r>
+              <w:rPr>
+                <w:b w:val="0"/>
+                <w:sz w:val="20"/>
+              </w:rPr>
+              <w:t>6. Дополнительные работы</w:t>
+            </w:r>
+          </w:p>
+        </w:tc>
+        <w:tc>
+          <w:tcPr>
+            <w:tcW w:type="dxa" w:w="1928"/>
+          </w:tcPr>
+          <w:p>
+            <w:pPr>
+              <w:keepNext/>
+              <w:spacing w:after="0"/>
+            </w:pPr>
+            <w:r>
+              <w:rPr>
+                <w:b w:val="0"/>
+                <w:sz w:val="20"/>
+              </w:rPr>
+              <w:t>3.9, 3.13, 3.15, 3.19</w:t>
+            </w:r>
+          </w:p>
+        </w:tc>
+        <w:tc>
+          <w:tcPr>
+            <w:tcW w:type="dxa" w:w="1644"/>
+          </w:tcPr>
+          <w:p>
+            <w:pPr>
+              <w:keepNext/>
+              <w:spacing w:after="0"/>
+            </w:pPr>
+            <w:r>
+              <w:rPr>
+                <w:b w:val="0"/>
+                <w:sz w:val="20"/>
+              </w:rPr>
+              <w:t>1 500–4 800</w:t>
+            </w:r>
+          </w:p>
+        </w:tc>
+        <w:tc>
+          <w:tcPr>
+            <w:tcW w:type="dxa" w:w="1814"/>
+          </w:tcPr>
+          <w:p>
+            <w:pPr>
+              <w:keepNext/>
+              <w:spacing w:after="0"/>
+            </w:pPr>
+            <w:r>
+              <w:rPr>
+                <w:b w:val="0"/>
+                <w:sz w:val="20"/>
+              </w:rPr>
+              <w:t>4 200–21 000</w:t>
+            </w:r>
+          </w:p>
+        </w:tc>
+        <w:tc>
+          <w:tcPr>
+            <w:tcW w:type="dxa" w:w="1531"/>
+          </w:tcPr>
+          <w:p>
+            <w:pPr>
+              <w:keepNext/>
+              <w:spacing w:after="0"/>
+              <w:jc w:val="right"/>
+            </w:pPr>
+            <w:r>
+              <w:rPr>
+                <w:b w:val="0"/>
+                <w:sz w:val="20"/>
+              </w:rPr>
+              <w:t>204 800,00</w:t>
+            </w:r>
+          </w:p>
+        </w:tc>
+      </w:tr>
+      <w:tr>
+        <w:trPr>
+          <w:cantSplit/>
+        </w:trPr>
+        <w:tc>
+          <w:tcPr>
+            <w:tcW w:type="dxa" w:w="2835"/>
+          </w:tcPr>
+          <w:p>
+            <w:pPr>
+              <w:keepNext/>
+              <w:spacing w:after="0"/>
+            </w:pPr>
+            <w:r>
+              <w:rPr>
+                <w:b w:val="0"/>
+                <w:sz w:val="20"/>
+              </w:rPr>
+              <w:t>7.1. Решётки защитные</w:t>
+            </w:r>
+          </w:p>
+        </w:tc>
+        <w:tc>
+          <w:tcPr>
+            <w:tcW w:type="dxa" w:w="1928"/>
+          </w:tcPr>
+          <w:p>
+            <w:pPr>
+              <w:keepNext/>
               <w:spacing w:after="0"/>
             </w:pPr>
             <w:r>
@@ -1980,6 +5089,7 @@
           </w:tcPr>
           <w:p>
             <w:pPr>
+              <w:keepNext/>
               <w:spacing w:after="0"/>
             </w:pPr>
             <w:r>
@@ -1997,6 +5107,7 @@
           </w:tcPr>
           <w:p>
             <w:pPr>
+              <w:keepNext/>
               <w:spacing w:after="0"/>
             </w:pPr>
             <w:r>
@@ -2014,6 +5125,7 @@
           </w:tcPr>
           <w:p>
             <w:pPr>
+              <w:keepNext/>
               <w:spacing w:after="0"/>
               <w:jc w:val="right"/>
             </w:pPr>
@@ -2028,12 +5140,16 @@
         </w:tc>
       </w:tr>
       <w:tr>
+        <w:trPr>
+          <w:cantSplit/>
+        </w:trPr>
         <w:tc>
           <w:tcPr>
             <w:tcW w:type="dxa" w:w="2835"/>
           </w:tcPr>
           <w:p>
             <w:pPr>
+              <w:keepNext/>
               <w:spacing w:after="0"/>
             </w:pPr>
             <w:r>
@@ -2041,7 +5157,7 @@
                 <w:b w:val="0"/>
                 <w:sz w:val="20"/>
               </w:rPr>
-              <w:t>3.3. Изоляция воздуховодов, 10 эт.</w:t>
+              <w:t>7.2. Ниппели</w:t>
             </w:r>
           </w:p>
         </w:tc>
@@ -2051,94 +5167,7 @@
           </w:tcPr>
           <w:p>
             <w:pPr>
-              <w:spacing w:after="0"/>
-            </w:pPr>
-            <w:r>
-              <w:rPr>
-                <w:b w:val="0"/>
-                <w:sz w:val="20"/>
-              </w:rPr>
-              <w:t>4.82–4.83</w:t>
-            </w:r>
-          </w:p>
-        </w:tc>
-        <w:tc>
-          <w:tcPr>
-            <w:tcW w:type="dxa" w:w="1644"/>
-          </w:tcPr>
-          <w:p>
-            <w:pPr>
-              <w:spacing w:after="0"/>
-            </w:pPr>
-            <w:r>
-              <w:rPr>
-                <w:b w:val="0"/>
-                <w:sz w:val="20"/>
-              </w:rPr>
-              <w:t>665</w:t>
-            </w:r>
-          </w:p>
-        </w:tc>
-        <w:tc>
-          <w:tcPr>
-            <w:tcW w:type="dxa" w:w="1814"/>
-          </w:tcPr>
-          <w:p>
-            <w:pPr>
-              <w:spacing w:after="0"/>
-            </w:pPr>
-            <w:r>
-              <w:rPr>
-                <w:b w:val="0"/>
-                <w:sz w:val="20"/>
-              </w:rPr>
-              <w:t>800</w:t>
-            </w:r>
-          </w:p>
-        </w:tc>
-        <w:tc>
-          <w:tcPr>
-            <w:tcW w:type="dxa" w:w="1531"/>
-          </w:tcPr>
-          <w:p>
-            <w:pPr>
-              <w:spacing w:after="0"/>
-              <w:jc w:val="right"/>
-            </w:pPr>
-            <w:r>
-              <w:rPr>
-                <w:b w:val="0"/>
-                <w:sz w:val="20"/>
-              </w:rPr>
-              <w:t>27 135,00</w:t>
-            </w:r>
-          </w:p>
-        </w:tc>
-      </w:tr>
-      <w:tr>
-        <w:tc>
-          <w:tcPr>
-            <w:tcW w:type="dxa" w:w="2835"/>
-          </w:tcPr>
-          <w:p>
-            <w:pPr>
-              <w:spacing w:after="0"/>
-            </w:pPr>
-            <w:r>
-              <w:rPr>
-                <w:b w:val="0"/>
-                <w:sz w:val="20"/>
-              </w:rPr>
-              <w:t>3.2. Ниппели</w:t>
-            </w:r>
-          </w:p>
-        </w:tc>
-        <w:tc>
-          <w:tcPr>
-            <w:tcW w:type="dxa" w:w="1928"/>
-          </w:tcPr>
-          <w:p>
-            <w:pPr>
+              <w:keepNext/>
               <w:spacing w:after="0"/>
             </w:pPr>
             <w:r>
@@ -2156,6 +5185,7 @@
           </w:tcPr>
           <w:p>
             <w:pPr>
+              <w:keepNext/>
               <w:spacing w:after="0"/>
             </w:pPr>
             <w:r>
@@ -2173,6 +5203,7 @@
           </w:tcPr>
           <w:p>
             <w:pPr>
+              <w:keepNext/>
               <w:spacing w:after="0"/>
             </w:pPr>
             <w:r>
@@ -2190,6 +5221,7 @@
           </w:tcPr>
           <w:p>
             <w:pPr>
+              <w:keepNext/>
               <w:spacing w:after="0"/>
               <w:jc w:val="right"/>
             </w:pPr>
@@ -2204,12 +5236,16 @@
         </w:tc>
       </w:tr>
       <w:tr>
+        <w:trPr>
+          <w:cantSplit/>
+        </w:trPr>
         <w:tc>
           <w:tcPr>
             <w:tcW w:type="dxa" w:w="2835"/>
           </w:tcPr>
           <w:p>
             <w:pPr>
+              <w:keepNext/>
               <w:spacing w:after="0"/>
             </w:pPr>
             <w:r>
@@ -2217,7 +5253,7 @@
                 <w:b w:val="0"/>
                 <w:sz w:val="20"/>
               </w:rPr>
-              <w:t>3.4. Врезки, тройник, переходы, 10 эт.</w:t>
+              <w:t>7.3. Врезки, тройник, переходы, 10 эт.</w:t>
             </w:r>
           </w:p>
         </w:tc>
@@ -2227,6 +5263,7 @@
           </w:tcPr>
           <w:p>
             <w:pPr>
+              <w:keepNext/>
               <w:spacing w:after="0"/>
             </w:pPr>
             <w:r>
@@ -2244,6 +5281,7 @@
           </w:tcPr>
           <w:p>
             <w:pPr>
+              <w:keepNext/>
               <w:spacing w:after="0"/>
             </w:pPr>
             <w:r>
@@ -2261,6 +5299,7 @@
           </w:tcPr>
           <w:p>
             <w:pPr>
+              <w:keepNext/>
               <w:spacing w:after="0"/>
             </w:pPr>
             <w:r>
@@ -2278,6 +5317,7 @@
           </w:tcPr>
           <w:p>
             <w:pPr>
+              <w:keepNext/>
               <w:spacing w:after="0"/>
               <w:jc w:val="right"/>
             </w:pPr>
@@ -2292,12 +5332,16 @@
         </w:tc>
       </w:tr>
       <w:tr>
+        <w:trPr>
+          <w:cantSplit/>
+        </w:trPr>
         <w:tc>
           <w:tcPr>
             <w:tcW w:type="dxa" w:w="2835"/>
           </w:tcPr>
           <w:p>
             <w:pPr>
+              <w:keepNext/>
               <w:spacing w:after="0"/>
             </w:pPr>
             <w:r>
@@ -2305,7 +5349,7 @@
                 <w:b w:val="0"/>
                 <w:sz w:val="20"/>
               </w:rPr>
-              <w:t>3.5. Отвод 15° Ø200</w:t>
+              <w:t>7.4. Отвод 15° Ø200</w:t>
             </w:r>
           </w:p>
         </w:tc>
@@ -2315,6 +5359,7 @@
           </w:tcPr>
           <w:p>
             <w:pPr>
+              <w:keepNext/>
               <w:spacing w:after="0"/>
             </w:pPr>
             <w:r>
@@ -2332,6 +5377,7 @@
           </w:tcPr>
           <w:p>
             <w:pPr>
+              <w:keepNext/>
               <w:spacing w:after="0"/>
             </w:pPr>
             <w:r>
@@ -2349,6 +5395,7 @@
           </w:tcPr>
           <w:p>
             <w:pPr>
+              <w:keepNext/>
               <w:spacing w:after="0"/>
             </w:pPr>
             <w:r>
@@ -2366,6 +5413,7 @@
           </w:tcPr>
           <w:p>
             <w:pPr>
+              <w:keepNext/>
               <w:spacing w:after="0"/>
               <w:jc w:val="right"/>
             </w:pPr>
@@ -2380,12 +5428,16 @@
         </w:tc>
       </w:tr>
       <w:tr>
+        <w:trPr>
+          <w:cantSplit/>
+        </w:trPr>
         <w:tc>
           <w:tcPr>
             <w:tcW w:type="dxa" w:w="2835"/>
           </w:tcPr>
           <w:p>
             <w:pPr>
+              <w:keepNext/>
               <w:spacing w:after="0"/>
             </w:pPr>
             <w:r>
@@ -2393,7 +5445,7 @@
                 <w:b w:val="0"/>
                 <w:sz w:val="20"/>
               </w:rPr>
-              <w:t>3.6. Заглушка 400×200</w:t>
+              <w:t>7.5. Заглушка 400×200</w:t>
             </w:r>
           </w:p>
         </w:tc>
@@ -2403,6 +5455,7 @@
           </w:tcPr>
           <w:p>
             <w:pPr>
+              <w:keepNext/>
               <w:spacing w:after="0"/>
             </w:pPr>
             <w:r>
@@ -2420,6 +5473,7 @@
           </w:tcPr>
           <w:p>
             <w:pPr>
+              <w:keepNext/>
               <w:spacing w:after="0"/>
             </w:pPr>
             <w:r>
@@ -2437,6 +5491,7 @@
           </w:tcPr>
           <w:p>
             <w:pPr>
+              <w:keepNext/>
               <w:spacing w:after="0"/>
             </w:pPr>
             <w:r>
@@ -2454,6 +5509,7 @@
           </w:tcPr>
           <w:p>
             <w:pPr>
+              <w:keepNext/>
               <w:spacing w:after="0"/>
               <w:jc w:val="right"/>
             </w:pPr>
@@ -2468,12 +5524,16 @@
         </w:tc>
       </w:tr>
       <w:tr>
+        <w:trPr>
+          <w:cantSplit/>
+        </w:trPr>
         <w:tc>
           <w:tcPr>
             <w:tcW w:type="dxa" w:w="2835"/>
           </w:tcPr>
           <w:p>
             <w:pPr>
+              <w:keepNext/>
               <w:spacing w:after="0"/>
             </w:pPr>
             <w:r>
@@ -2491,6 +5551,7 @@
           </w:tcPr>
           <w:p>
             <w:pPr>
+              <w:keepNext/>
               <w:spacing w:after="0"/>
             </w:pPr>
             <w:r>
@@ -2507,6 +5568,7 @@
           </w:tcPr>
           <w:p>
             <w:pPr>
+              <w:keepNext/>
               <w:spacing w:after="0"/>
             </w:pPr>
             <w:r>
@@ -2523,6 +5585,7 @@
           </w:tcPr>
           <w:p>
             <w:pPr>
+              <w:keepNext/>
               <w:spacing w:after="0"/>
             </w:pPr>
             <w:r>
@@ -2539,6 +5602,7 @@
           </w:tcPr>
           <w:p>
             <w:pPr>
+              <w:keepNext/>
               <w:spacing w:after="0"/>
               <w:jc w:val="right"/>
             </w:pPr>
@@ -2547,12 +5611,15 @@
                 <w:b/>
                 <w:sz w:val="20"/>
               </w:rPr>
-              <w:t>2 768 111,16</w:t>
+              <w:t>4 230 361,16</w:t>
             </w:r>
           </w:p>
         </w:tc>
       </w:tr>
       <w:tr>
+        <w:trPr>
+          <w:cantSplit/>
+        </w:trPr>
         <w:tc>
           <w:tcPr>
             <w:tcW w:type="dxa" w:w="2835"/>
@@ -2566,7 +5633,7 @@
                 <w:b w:val="0"/>
                 <w:sz w:val="20"/>
               </w:rPr>
-              <w:t>4. Дымоудаление (допсоглашение)</w:t>
+              <w:t>8. Дымоудаление (допсоглашение)</w:t>
             </w:r>
           </w:p>
         </w:tc>
@@ -2648,19 +5715,20 @@
     </w:p>
     <w:p>
       <w:pPr>
+        <w:keepNext/>
         <w:jc w:val="both"/>
       </w:pPr>
       <w:r>
         <w:rPr>
           <w:b/>
         </w:rPr>
-        <w:t>Итоговая стоимость работ с учётом наших возражений — 18 842 308,30 ₽</w:t>
+        <w:t>Итоговая стоимость работ с учётом наших возражений — 20 304 558,30 ₽</w:t>
       </w:r>
       <w:r>
         <w:rPr>
           <w:b w:val="0"/>
         </w:rPr>
-        <w:t>, с дымоудалением — 19 870 788,30 ₽.</w:t>
+        <w:t>, с дымоудалением — 21 333 038,30 ₽.</w:t>
       </w:r>
     </w:p>
     <w:tbl>
@@ -2676,6 +5744,9 @@
         <w:gridCol w:w="2268"/>
       </w:tblGrid>
       <w:tr>
+        <w:trPr>
+          <w:cantSplit/>
+        </w:trPr>
         <w:tc>
           <w:tcPr>
             <w:tcW w:type="dxa" w:w="7087"/>
@@ -2683,6 +5754,7 @@
           </w:tcPr>
           <w:p>
             <w:pPr>
+              <w:keepNext/>
               <w:jc w:val="center"/>
             </w:pPr>
             <w:r/>
@@ -2702,6 +5774,7 @@
           </w:tcPr>
           <w:p>
             <w:pPr>
+              <w:keepNext/>
               <w:jc w:val="center"/>
             </w:pPr>
             <w:r/>
@@ -2716,12 +5789,16 @@
         </w:tc>
       </w:tr>
       <w:tr>
+        <w:trPr>
+          <w:cantSplit/>
+        </w:trPr>
         <w:tc>
           <w:tcPr>
             <w:tcW w:type="dxa" w:w="7087"/>
           </w:tcPr>
           <w:p>
             <w:pPr>
+              <w:keepNext/>
               <w:spacing w:after="0"/>
             </w:pPr>
             <w:r>
@@ -2739,6 +5816,7 @@
           </w:tcPr>
           <w:p>
             <w:pPr>
+              <w:keepNext/>
               <w:spacing w:after="0"/>
               <w:jc w:val="right"/>
             </w:pPr>
@@ -2753,12 +5831,16 @@
         </w:tc>
       </w:tr>
       <w:tr>
+        <w:trPr>
+          <w:cantSplit/>
+        </w:trPr>
         <w:tc>
           <w:tcPr>
             <w:tcW w:type="dxa" w:w="7087"/>
           </w:tcPr>
           <w:p>
             <w:pPr>
+              <w:keepNext/>
               <w:spacing w:after="0"/>
             </w:pPr>
             <w:r>
@@ -2776,6 +5858,7 @@
           </w:tcPr>
           <w:p>
             <w:pPr>
+              <w:keepNext/>
               <w:spacing w:after="0"/>
               <w:jc w:val="right"/>
             </w:pPr>
@@ -2784,18 +5867,22 @@
                 <w:b w:val="0"/>
                 <w:sz w:val="20"/>
               </w:rPr>
-              <w:t>6 114 009,36</w:t>
+              <w:t>7 576 259,36</w:t>
             </w:r>
           </w:p>
         </w:tc>
       </w:tr>
       <w:tr>
+        <w:trPr>
+          <w:cantSplit/>
+        </w:trPr>
         <w:tc>
           <w:tcPr>
             <w:tcW w:type="dxa" w:w="7087"/>
           </w:tcPr>
           <w:p>
             <w:pPr>
+              <w:keepNext/>
               <w:spacing w:after="0"/>
             </w:pPr>
             <w:r>
@@ -2813,6 +5900,7 @@
           </w:tcPr>
           <w:p>
             <w:pPr>
+              <w:keepNext/>
               <w:spacing w:after="0"/>
               <w:jc w:val="right"/>
             </w:pPr>
@@ -2821,18 +5909,22 @@
                 <w:b/>
                 <w:sz w:val="20"/>
               </w:rPr>
-              <w:t>18 842 308,30</w:t>
+              <w:t>20 304 558,30</w:t>
             </w:r>
           </w:p>
         </w:tc>
       </w:tr>
       <w:tr>
+        <w:trPr>
+          <w:cantSplit/>
+        </w:trPr>
         <w:tc>
           <w:tcPr>
             <w:tcW w:type="dxa" w:w="7087"/>
           </w:tcPr>
           <w:p>
             <w:pPr>
+              <w:keepNext/>
               <w:spacing w:after="0"/>
             </w:pPr>
             <w:r>
@@ -2850,6 +5942,7 @@
           </w:tcPr>
           <w:p>
             <w:pPr>
+              <w:keepNext/>
               <w:spacing w:after="0"/>
               <w:jc w:val="right"/>
             </w:pPr>
@@ -2864,6 +5957,9 @@
         </w:tc>
       </w:tr>
       <w:tr>
+        <w:trPr>
+          <w:cantSplit/>
+        </w:trPr>
         <w:tc>
           <w:tcPr>
             <w:tcW w:type="dxa" w:w="7087"/>
@@ -2895,7 +5991,7 @@
                 <w:b/>
                 <w:sz w:val="20"/>
               </w:rPr>
-              <w:t>19 870 788,30</w:t>
+              <w:t>21 333 038,30</w:t>
             </w:r>
           </w:p>
         </w:tc>
@@ -2915,7 +6011,7 @@
         <w:rPr>
           <w:b w:val="0"/>
         </w:rPr>
-        <w:t>Для сравнения: Ваша редакция КП с учётом всех комментариев — 16 074 197,14 ₽, разница — 2 768 111,16 ₽. Исходное КП — 22 665 254,14 ₽.</w:t>
+        <w:t>Для сравнения: Ваша редакция КП с учётом всех комментариев — 16 074 197,14 ₽, разница — 4 230 361,16 ₽. Исходное КП — 22 665 254,14 ₽.</w:t>
       </w:r>
     </w:p>
     <w:p>

</xml_diff>

<commit_message>
Add pipe insulation objections to customer letter
Co-Authored-By: Claude Opus 5.5 <noreply@anthropic.com>
Claude-Session: https://claude.ai/code/session_01MXDAyRkZCZe1vQqjdWh53W
</commit_message>
<xml_diff>
--- a/out/Письмо_заказчику_возражения_по_КП.docx
+++ b/out/Письмо_заказчику_возражения_по_КП.docx
@@ -2237,7 +2237,7 @@
           <w:b/>
           <w:sz w:val="24"/>
         </w:rPr>
-        <w:t>5. Изоляция воздуховодов и фасонных изделий — 695 425 ₽</w:t>
+        <w:t>5. Изоляция воздуховодов, фасонных изделий и трубопроводов — 781 359 ₽</w:t>
       </w:r>
     </w:p>
     <w:p>
@@ -3216,6 +3216,702 @@
           </w:tcPr>
           <w:p>
             <w:pPr>
+              <w:keepNext/>
+              <w:spacing w:after="0"/>
+            </w:pPr>
+            <w:r>
+              <w:rPr>
+                <w:b w:val="0"/>
+                <w:sz w:val="20"/>
+              </w:rPr>
+              <w:t>5.33</w:t>
+            </w:r>
+          </w:p>
+        </w:tc>
+        <w:tc>
+          <w:tcPr>
+            <w:tcW w:type="dxa" w:w="3628"/>
+          </w:tcPr>
+          <w:p>
+            <w:pPr>
+              <w:keepNext/>
+              <w:spacing w:after="0"/>
+            </w:pPr>
+            <w:r>
+              <w:rPr>
+                <w:b w:val="0"/>
+                <w:sz w:val="20"/>
+              </w:rPr>
+              <w:t>Трубки теплоизоляционные для трубы Ø32×5,4, 6 мм, 10 эт.</w:t>
+            </w:r>
+          </w:p>
+        </w:tc>
+        <w:tc>
+          <w:tcPr>
+            <w:tcW w:type="dxa" w:w="907"/>
+          </w:tcPr>
+          <w:p>
+            <w:pPr>
+              <w:keepNext/>
+              <w:spacing w:after="0"/>
+            </w:pPr>
+            <w:r>
+              <w:rPr>
+                <w:b w:val="0"/>
+                <w:sz w:val="20"/>
+              </w:rPr>
+              <w:t>75 шт.</w:t>
+            </w:r>
+          </w:p>
+        </w:tc>
+        <w:tc>
+          <w:tcPr>
+            <w:tcW w:type="dxa" w:w="1361"/>
+          </w:tcPr>
+          <w:p>
+            <w:pPr>
+              <w:keepNext/>
+              <w:spacing w:after="0"/>
+              <w:jc w:val="right"/>
+            </w:pPr>
+            <w:r>
+              <w:rPr>
+                <w:b w:val="0"/>
+                <w:sz w:val="20"/>
+              </w:rPr>
+              <w:t>1 020</w:t>
+            </w:r>
+          </w:p>
+        </w:tc>
+        <w:tc>
+          <w:tcPr>
+            <w:tcW w:type="dxa" w:w="1361"/>
+          </w:tcPr>
+          <w:p>
+            <w:pPr>
+              <w:keepNext/>
+              <w:spacing w:after="0"/>
+              <w:jc w:val="right"/>
+            </w:pPr>
+            <w:r>
+              <w:rPr>
+                <w:b w:val="0"/>
+                <w:sz w:val="20"/>
+              </w:rPr>
+              <w:t>200</w:t>
+            </w:r>
+          </w:p>
+        </w:tc>
+        <w:tc>
+          <w:tcPr>
+            <w:tcW w:type="dxa" w:w="1361"/>
+          </w:tcPr>
+          <w:p>
+            <w:pPr>
+              <w:keepNext/>
+              <w:spacing w:after="0"/>
+              <w:jc w:val="right"/>
+            </w:pPr>
+            <w:r>
+              <w:rPr>
+                <w:b w:val="0"/>
+                <w:sz w:val="20"/>
+              </w:rPr>
+              <w:t>61 500</w:t>
+            </w:r>
+          </w:p>
+        </w:tc>
+      </w:tr>
+      <w:tr>
+        <w:trPr>
+          <w:cantSplit/>
+        </w:trPr>
+        <w:tc>
+          <w:tcPr>
+            <w:tcW w:type="dxa" w:w="850"/>
+          </w:tcPr>
+          <w:p>
+            <w:pPr>
+              <w:keepNext/>
+              <w:spacing w:after="0"/>
+            </w:pPr>
+            <w:r>
+              <w:rPr>
+                <w:b w:val="0"/>
+                <w:sz w:val="20"/>
+              </w:rPr>
+              <w:t>5.19</w:t>
+            </w:r>
+          </w:p>
+        </w:tc>
+        <w:tc>
+          <w:tcPr>
+            <w:tcW w:type="dxa" w:w="3628"/>
+          </w:tcPr>
+          <w:p>
+            <w:pPr>
+              <w:keepNext/>
+              <w:spacing w:after="0"/>
+            </w:pPr>
+            <w:r>
+              <w:rPr>
+                <w:b w:val="0"/>
+                <w:sz w:val="20"/>
+              </w:rPr>
+              <w:t>Трубки теплоизоляционные для трубы Ø32×4,4, 9 мм, 10 эт.</w:t>
+            </w:r>
+          </w:p>
+        </w:tc>
+        <w:tc>
+          <w:tcPr>
+            <w:tcW w:type="dxa" w:w="907"/>
+          </w:tcPr>
+          <w:p>
+            <w:pPr>
+              <w:keepNext/>
+              <w:spacing w:after="0"/>
+            </w:pPr>
+            <w:r>
+              <w:rPr>
+                <w:b w:val="0"/>
+                <w:sz w:val="20"/>
+              </w:rPr>
+              <w:t>90 м.п.</w:t>
+            </w:r>
+          </w:p>
+        </w:tc>
+        <w:tc>
+          <w:tcPr>
+            <w:tcW w:type="dxa" w:w="1361"/>
+          </w:tcPr>
+          <w:p>
+            <w:pPr>
+              <w:keepNext/>
+              <w:spacing w:after="0"/>
+              <w:jc w:val="right"/>
+            </w:pPr>
+            <w:r>
+              <w:rPr>
+                <w:b w:val="0"/>
+                <w:sz w:val="20"/>
+              </w:rPr>
+              <w:t>291,60</w:t>
+            </w:r>
+          </w:p>
+        </w:tc>
+        <w:tc>
+          <w:tcPr>
+            <w:tcW w:type="dxa" w:w="1361"/>
+          </w:tcPr>
+          <w:p>
+            <w:pPr>
+              <w:keepNext/>
+              <w:spacing w:after="0"/>
+              <w:jc w:val="right"/>
+            </w:pPr>
+            <w:r>
+              <w:rPr>
+                <w:b w:val="0"/>
+                <w:sz w:val="20"/>
+              </w:rPr>
+              <w:t>200</w:t>
+            </w:r>
+          </w:p>
+        </w:tc>
+        <w:tc>
+          <w:tcPr>
+            <w:tcW w:type="dxa" w:w="1361"/>
+          </w:tcPr>
+          <w:p>
+            <w:pPr>
+              <w:keepNext/>
+              <w:spacing w:after="0"/>
+              <w:jc w:val="right"/>
+            </w:pPr>
+            <w:r>
+              <w:rPr>
+                <w:b w:val="0"/>
+                <w:sz w:val="20"/>
+              </w:rPr>
+              <w:t>8 244</w:t>
+            </w:r>
+          </w:p>
+        </w:tc>
+      </w:tr>
+      <w:tr>
+        <w:trPr>
+          <w:cantSplit/>
+        </w:trPr>
+        <w:tc>
+          <w:tcPr>
+            <w:tcW w:type="dxa" w:w="850"/>
+          </w:tcPr>
+          <w:p>
+            <w:pPr>
+              <w:keepNext/>
+              <w:spacing w:after="0"/>
+            </w:pPr>
+            <w:r>
+              <w:rPr>
+                <w:b w:val="0"/>
+                <w:sz w:val="20"/>
+              </w:rPr>
+              <w:t>7.7</w:t>
+            </w:r>
+          </w:p>
+        </w:tc>
+        <w:tc>
+          <w:tcPr>
+            <w:tcW w:type="dxa" w:w="3628"/>
+          </w:tcPr>
+          <w:p>
+            <w:pPr>
+              <w:keepNext/>
+              <w:spacing w:after="0"/>
+            </w:pPr>
+            <w:r>
+              <w:rPr>
+                <w:b w:val="0"/>
+                <w:sz w:val="20"/>
+              </w:rPr>
+              <w:t>Теплоизоляция труб, 2 эт.</w:t>
+            </w:r>
+          </w:p>
+        </w:tc>
+        <w:tc>
+          <w:tcPr>
+            <w:tcW w:type="dxa" w:w="907"/>
+          </w:tcPr>
+          <w:p>
+            <w:pPr>
+              <w:keepNext/>
+              <w:spacing w:after="0"/>
+            </w:pPr>
+            <w:r>
+              <w:rPr>
+                <w:b w:val="0"/>
+                <w:sz w:val="20"/>
+              </w:rPr>
+              <w:t>30 м.п.</w:t>
+            </w:r>
+          </w:p>
+        </w:tc>
+        <w:tc>
+          <w:tcPr>
+            <w:tcW w:type="dxa" w:w="1361"/>
+          </w:tcPr>
+          <w:p>
+            <w:pPr>
+              <w:keepNext/>
+              <w:spacing w:after="0"/>
+              <w:jc w:val="right"/>
+            </w:pPr>
+            <w:r>
+              <w:rPr>
+                <w:b w:val="0"/>
+                <w:sz w:val="20"/>
+              </w:rPr>
+              <w:t>486</w:t>
+            </w:r>
+          </w:p>
+        </w:tc>
+        <w:tc>
+          <w:tcPr>
+            <w:tcW w:type="dxa" w:w="1361"/>
+          </w:tcPr>
+          <w:p>
+            <w:pPr>
+              <w:keepNext/>
+              <w:spacing w:after="0"/>
+              <w:jc w:val="right"/>
+            </w:pPr>
+            <w:r>
+              <w:rPr>
+                <w:b w:val="0"/>
+                <w:sz w:val="20"/>
+              </w:rPr>
+              <w:t>228</w:t>
+            </w:r>
+          </w:p>
+        </w:tc>
+        <w:tc>
+          <w:tcPr>
+            <w:tcW w:type="dxa" w:w="1361"/>
+          </w:tcPr>
+          <w:p>
+            <w:pPr>
+              <w:keepNext/>
+              <w:spacing w:after="0"/>
+              <w:jc w:val="right"/>
+            </w:pPr>
+            <w:r>
+              <w:rPr>
+                <w:b w:val="0"/>
+                <w:sz w:val="20"/>
+              </w:rPr>
+              <w:t>7 740</w:t>
+            </w:r>
+          </w:p>
+        </w:tc>
+      </w:tr>
+      <w:tr>
+        <w:trPr>
+          <w:cantSplit/>
+        </w:trPr>
+        <w:tc>
+          <w:tcPr>
+            <w:tcW w:type="dxa" w:w="850"/>
+          </w:tcPr>
+          <w:p>
+            <w:pPr>
+              <w:keepNext/>
+              <w:spacing w:after="0"/>
+            </w:pPr>
+            <w:r>
+              <w:rPr>
+                <w:b w:val="0"/>
+                <w:sz w:val="20"/>
+              </w:rPr>
+              <w:t>5.34</w:t>
+            </w:r>
+          </w:p>
+        </w:tc>
+        <w:tc>
+          <w:tcPr>
+            <w:tcW w:type="dxa" w:w="3628"/>
+          </w:tcPr>
+          <w:p>
+            <w:pPr>
+              <w:keepNext/>
+              <w:spacing w:after="0"/>
+            </w:pPr>
+            <w:r>
+              <w:rPr>
+                <w:b w:val="0"/>
+                <w:sz w:val="20"/>
+              </w:rPr>
+              <w:t>Трубки теплоизоляционные для трубы Ø40×6,7, 6 мм, 10 эт.</w:t>
+            </w:r>
+          </w:p>
+        </w:tc>
+        <w:tc>
+          <w:tcPr>
+            <w:tcW w:type="dxa" w:w="907"/>
+          </w:tcPr>
+          <w:p>
+            <w:pPr>
+              <w:keepNext/>
+              <w:spacing w:after="0"/>
+            </w:pPr>
+            <w:r>
+              <w:rPr>
+                <w:b w:val="0"/>
+                <w:sz w:val="20"/>
+              </w:rPr>
+              <w:t>8 шт.</w:t>
+            </w:r>
+          </w:p>
+        </w:tc>
+        <w:tc>
+          <w:tcPr>
+            <w:tcW w:type="dxa" w:w="1361"/>
+          </w:tcPr>
+          <w:p>
+            <w:pPr>
+              <w:keepNext/>
+              <w:spacing w:after="0"/>
+              <w:jc w:val="right"/>
+            </w:pPr>
+            <w:r>
+              <w:rPr>
+                <w:b w:val="0"/>
+                <w:sz w:val="20"/>
+              </w:rPr>
+              <w:t>1 020</w:t>
+            </w:r>
+          </w:p>
+        </w:tc>
+        <w:tc>
+          <w:tcPr>
+            <w:tcW w:type="dxa" w:w="1361"/>
+          </w:tcPr>
+          <w:p>
+            <w:pPr>
+              <w:keepNext/>
+              <w:spacing w:after="0"/>
+              <w:jc w:val="right"/>
+            </w:pPr>
+            <w:r>
+              <w:rPr>
+                <w:b w:val="0"/>
+                <w:sz w:val="20"/>
+              </w:rPr>
+              <w:t>260</w:t>
+            </w:r>
+          </w:p>
+        </w:tc>
+        <w:tc>
+          <w:tcPr>
+            <w:tcW w:type="dxa" w:w="1361"/>
+          </w:tcPr>
+          <w:p>
+            <w:pPr>
+              <w:keepNext/>
+              <w:spacing w:after="0"/>
+              <w:jc w:val="right"/>
+            </w:pPr>
+            <w:r>
+              <w:rPr>
+                <w:b w:val="0"/>
+                <w:sz w:val="20"/>
+              </w:rPr>
+              <w:t>6 080</w:t>
+            </w:r>
+          </w:p>
+        </w:tc>
+      </w:tr>
+      <w:tr>
+        <w:trPr>
+          <w:cantSplit/>
+        </w:trPr>
+        <w:tc>
+          <w:tcPr>
+            <w:tcW w:type="dxa" w:w="850"/>
+          </w:tcPr>
+          <w:p>
+            <w:pPr>
+              <w:keepNext/>
+              <w:spacing w:after="0"/>
+            </w:pPr>
+            <w:r>
+              <w:rPr>
+                <w:b w:val="0"/>
+                <w:sz w:val="20"/>
+              </w:rPr>
+              <w:t>5.21</w:t>
+            </w:r>
+          </w:p>
+        </w:tc>
+        <w:tc>
+          <w:tcPr>
+            <w:tcW w:type="dxa" w:w="3628"/>
+          </w:tcPr>
+          <w:p>
+            <w:pPr>
+              <w:keepNext/>
+              <w:spacing w:after="0"/>
+            </w:pPr>
+            <w:r>
+              <w:rPr>
+                <w:b w:val="0"/>
+                <w:sz w:val="20"/>
+              </w:rPr>
+              <w:t>Трубки теплоизоляционные для трубы Ø50×6,9, 13 мм, 10 эт.</w:t>
+            </w:r>
+          </w:p>
+        </w:tc>
+        <w:tc>
+          <w:tcPr>
+            <w:tcW w:type="dxa" w:w="907"/>
+          </w:tcPr>
+          <w:p>
+            <w:pPr>
+              <w:keepNext/>
+              <w:spacing w:after="0"/>
+            </w:pPr>
+            <w:r>
+              <w:rPr>
+                <w:b w:val="0"/>
+                <w:sz w:val="20"/>
+              </w:rPr>
+              <w:t>40 м.п.</w:t>
+            </w:r>
+          </w:p>
+        </w:tc>
+        <w:tc>
+          <w:tcPr>
+            <w:tcW w:type="dxa" w:w="1361"/>
+          </w:tcPr>
+          <w:p>
+            <w:pPr>
+              <w:keepNext/>
+              <w:spacing w:after="0"/>
+              <w:jc w:val="right"/>
+            </w:pPr>
+            <w:r>
+              <w:rPr>
+                <w:b w:val="0"/>
+                <w:sz w:val="20"/>
+              </w:rPr>
+              <w:t>291,60</w:t>
+            </w:r>
+          </w:p>
+        </w:tc>
+        <w:tc>
+          <w:tcPr>
+            <w:tcW w:type="dxa" w:w="1361"/>
+          </w:tcPr>
+          <w:p>
+            <w:pPr>
+              <w:keepNext/>
+              <w:spacing w:after="0"/>
+              <w:jc w:val="right"/>
+            </w:pPr>
+            <w:r>
+              <w:rPr>
+                <w:b w:val="0"/>
+                <w:sz w:val="20"/>
+              </w:rPr>
+              <w:t>260</w:t>
+            </w:r>
+          </w:p>
+        </w:tc>
+        <w:tc>
+          <w:tcPr>
+            <w:tcW w:type="dxa" w:w="1361"/>
+          </w:tcPr>
+          <w:p>
+            <w:pPr>
+              <w:keepNext/>
+              <w:spacing w:after="0"/>
+              <w:jc w:val="right"/>
+            </w:pPr>
+            <w:r>
+              <w:rPr>
+                <w:b w:val="0"/>
+                <w:sz w:val="20"/>
+              </w:rPr>
+              <w:t>1 264</w:t>
+            </w:r>
+          </w:p>
+        </w:tc>
+      </w:tr>
+      <w:tr>
+        <w:trPr>
+          <w:cantSplit/>
+        </w:trPr>
+        <w:tc>
+          <w:tcPr>
+            <w:tcW w:type="dxa" w:w="850"/>
+          </w:tcPr>
+          <w:p>
+            <w:pPr>
+              <w:keepNext/>
+              <w:spacing w:after="0"/>
+            </w:pPr>
+            <w:r>
+              <w:rPr>
+                <w:b w:val="0"/>
+                <w:sz w:val="20"/>
+              </w:rPr>
+              <w:t>5.20</w:t>
+            </w:r>
+          </w:p>
+        </w:tc>
+        <w:tc>
+          <w:tcPr>
+            <w:tcW w:type="dxa" w:w="3628"/>
+          </w:tcPr>
+          <w:p>
+            <w:pPr>
+              <w:keepNext/>
+              <w:spacing w:after="0"/>
+            </w:pPr>
+            <w:r>
+              <w:rPr>
+                <w:b w:val="0"/>
+                <w:sz w:val="20"/>
+              </w:rPr>
+              <w:t>Трубки теплоизоляционные для трубы Ø40×5,5, 9 мм, 10 эт.</w:t>
+            </w:r>
+          </w:p>
+        </w:tc>
+        <w:tc>
+          <w:tcPr>
+            <w:tcW w:type="dxa" w:w="907"/>
+          </w:tcPr>
+          <w:p>
+            <w:pPr>
+              <w:keepNext/>
+              <w:spacing w:after="0"/>
+            </w:pPr>
+            <w:r>
+              <w:rPr>
+                <w:b w:val="0"/>
+                <w:sz w:val="20"/>
+              </w:rPr>
+              <w:t>35 м.п.</w:t>
+            </w:r>
+          </w:p>
+        </w:tc>
+        <w:tc>
+          <w:tcPr>
+            <w:tcW w:type="dxa" w:w="1361"/>
+          </w:tcPr>
+          <w:p>
+            <w:pPr>
+              <w:keepNext/>
+              <w:spacing w:after="0"/>
+              <w:jc w:val="right"/>
+            </w:pPr>
+            <w:r>
+              <w:rPr>
+                <w:b w:val="0"/>
+                <w:sz w:val="20"/>
+              </w:rPr>
+              <w:t>291,60</w:t>
+            </w:r>
+          </w:p>
+        </w:tc>
+        <w:tc>
+          <w:tcPr>
+            <w:tcW w:type="dxa" w:w="1361"/>
+          </w:tcPr>
+          <w:p>
+            <w:pPr>
+              <w:keepNext/>
+              <w:spacing w:after="0"/>
+              <w:jc w:val="right"/>
+            </w:pPr>
+            <w:r>
+              <w:rPr>
+                <w:b w:val="0"/>
+                <w:sz w:val="20"/>
+              </w:rPr>
+              <w:t>260</w:t>
+            </w:r>
+          </w:p>
+        </w:tc>
+        <w:tc>
+          <w:tcPr>
+            <w:tcW w:type="dxa" w:w="1361"/>
+          </w:tcPr>
+          <w:p>
+            <w:pPr>
+              <w:keepNext/>
+              <w:spacing w:after="0"/>
+              <w:jc w:val="right"/>
+            </w:pPr>
+            <w:r>
+              <w:rPr>
+                <w:b w:val="0"/>
+                <w:sz w:val="20"/>
+              </w:rPr>
+              <w:t>1 106</w:t>
+            </w:r>
+          </w:p>
+        </w:tc>
+      </w:tr>
+      <w:tr>
+        <w:trPr>
+          <w:cantSplit/>
+        </w:trPr>
+        <w:tc>
+          <w:tcPr>
+            <w:tcW w:type="dxa" w:w="850"/>
+          </w:tcPr>
+          <w:p>
+            <w:pPr>
               <w:spacing w:after="0"/>
             </w:pPr>
             <w:r>
@@ -3307,7 +4003,7 @@
                 <w:b/>
                 <w:sz w:val="20"/>
               </w:rPr>
-              <w:t>695 425</w:t>
+              <w:t>781 359</w:t>
             </w:r>
           </w:p>
         </w:tc>
@@ -3352,6 +4048,24 @@
           <w:b w:val="0"/>
         </w:rPr>
         <w:t xml:space="preserve"> На отводах, тройниках и переходах раскрой сложный, и изоляция одного изделия занимает намного больше времени, чем такая же площадь прямого воздуховода. Поэтому расценка по площади на изделия не применима.</w:t>
+      </w:r>
+    </w:p>
+    <w:p>
+      <w:pPr>
+        <w:pStyle w:val="ListBullet"/>
+        <w:jc w:val="both"/>
+      </w:pPr>
+      <w:r>
+        <w:rPr>
+          <w:b/>
+        </w:rPr>
+        <w:t>Изоляция трубопроводов на 10 и 2 этажах.</w:t>
+      </w:r>
+      <w:r>
+        <w:rPr>
+          <w:b w:val="0"/>
+        </w:rPr>
+        <w:t xml:space="preserve"> Цены ДС № 1 на изоляцию труб (150 и 228 ₽, п. 2.37–2.41) рассчитаны на типовые этажи. На 10 и 2 этажах трубопроводы изолируются на большей высоте и с требованиями видовых этажей (раздел 3), поэтому цены типовых этажей к ним не применимы.</w:t>
       </w:r>
     </w:p>
     <w:p>
@@ -4440,7 +5154,7 @@
         <w:rPr>
           <w:b w:val="0"/>
         </w:rPr>
-        <w:t>Просим вернуть в КП 4 230 361,16 ₽ по разделам 1, 2 и 4–7, из них 1 495 574,98 ₽ — цены, уже подписанные в ДС № 1. Ещё 1 028 480 ₽ по дымоудалению уходят в отдельное допсоглашение.</w:t>
+        <w:t>Просим вернуть в КП 4 316 295,16 ₽ по разделам 1, 2 и 4–7, из них 1 495 574,98 ₽ — цены, уже подписанные в ДС № 1. Ещё 1 028 480 ₽ по дымоудалению уходят в отдельное допсоглашение.</w:t>
       </w:r>
     </w:p>
     <w:tbl>
@@ -4869,7 +5583,7 @@
                 <w:b w:val="0"/>
                 <w:sz w:val="20"/>
               </w:rPr>
-              <w:t>5. Изоляция</w:t>
+              <w:t>5. Изоляция воздуховодов, изделий и труб</w:t>
             </w:r>
           </w:p>
         </w:tc>
@@ -4887,7 +5601,7 @@
                 <w:b w:val="0"/>
                 <w:sz w:val="20"/>
               </w:rPr>
-              <w:t>3.7, 4.80–4.83, 6.72–6.73</w:t>
+              <w:t>3.7, 4.80–4.83, 6.72–6.73, 5.19–5.21, 5.33–5.34, 7.7</w:t>
             </w:r>
           </w:p>
         </w:tc>
@@ -4905,7 +5619,7 @@
                 <w:b w:val="0"/>
                 <w:sz w:val="20"/>
               </w:rPr>
-              <w:t>450–800</w:t>
+              <w:t>200–800</w:t>
             </w:r>
           </w:p>
         </w:tc>
@@ -4923,7 +5637,7 @@
                 <w:b w:val="0"/>
                 <w:sz w:val="20"/>
               </w:rPr>
-              <w:t>840–3 240</w:t>
+              <w:t>291,60–3 240</w:t>
             </w:r>
           </w:p>
         </w:tc>
@@ -4942,7 +5656,7 @@
                 <w:b w:val="0"/>
                 <w:sz w:val="20"/>
               </w:rPr>
-              <w:t>695 425,00</w:t>
+              <w:t>781 359,00</w:t>
             </w:r>
           </w:p>
         </w:tc>
@@ -5611,7 +6325,7 @@
                 <w:b/>
                 <w:sz w:val="20"/>
               </w:rPr>
-              <w:t>4 230 361,16</w:t>
+              <w:t>4 316 295,16</w:t>
             </w:r>
           </w:p>
         </w:tc>
@@ -5722,13 +6436,13 @@
         <w:rPr>
           <w:b/>
         </w:rPr>
-        <w:t>Итоговая стоимость работ с учётом наших возражений — 20 304 558,30 ₽</w:t>
+        <w:t>Итоговая стоимость работ с учётом наших возражений — 20 390 492,30 ₽</w:t>
       </w:r>
       <w:r>
         <w:rPr>
           <w:b w:val="0"/>
         </w:rPr>
-        <w:t>, с дымоудалением — 21 333 038,30 ₽.</w:t>
+        <w:t>, с дымоудалением — 21 418 972,30 ₽.</w:t>
       </w:r>
     </w:p>
     <w:tbl>
@@ -5867,7 +6581,7 @@
                 <w:b w:val="0"/>
                 <w:sz w:val="20"/>
               </w:rPr>
-              <w:t>7 576 259,36</w:t>
+              <w:t>7 662 193,36</w:t>
             </w:r>
           </w:p>
         </w:tc>
@@ -5909,7 +6623,7 @@
                 <w:b/>
                 <w:sz w:val="20"/>
               </w:rPr>
-              <w:t>20 304 558,30</w:t>
+              <w:t>20 390 492,30</w:t>
             </w:r>
           </w:p>
         </w:tc>
@@ -5991,7 +6705,7 @@
                 <w:b/>
                 <w:sz w:val="20"/>
               </w:rPr>
-              <w:t>21 333 038,30</w:t>
+              <w:t>21 418 972,30</w:t>
             </w:r>
           </w:p>
         </w:tc>
@@ -6011,7 +6725,7 @@
         <w:rPr>
           <w:b w:val="0"/>
         </w:rPr>
-        <w:t>Для сравнения: Ваша редакция КП с учётом всех комментариев — 16 074 197,14 ₽, разница — 4 230 361,16 ₽. Исходное КП — 22 665 254,14 ₽.</w:t>
+        <w:t>Для сравнения: Ваша редакция КП с учётом всех комментариев — 16 074 197,14 ₽, разница — 4 316 295,16 ₽. Исходное КП — 22 665 254,14 ₽.</w:t>
       </w:r>
     </w:p>
     <w:p>

</xml_diff>

<commit_message>
Use en dashes and drop response deadline in customer letter
Co-Authored-By: Claude Opus 5.5 <noreply@anthropic.com>
Claude-Session: https://claude.ai/code/session_01MXDAyRkZCZe1vQqjdWh53W
</commit_message>
<xml_diff>
--- a/out/Письмо_заказчику_возражения_по_КП.docx
+++ b/out/Письмо_заказчику_возражения_по_КП.docx
@@ -93,7 +93,7 @@
         <w:rPr>
           <w:b w:val="0"/>
         </w:rPr>
-        <w:t>Работы на 3, 7–9 этажах выполняются по Договору подряда № СПБ-ГАЗЭ/ОВ/7-9 от 19.06.2026 в редакции Дополнительного соглашения № 1 от 27.07.2026 (далее — ДС № 1). ДС № 1 подписано сторонами через ЭДО «Контур.Диадок» 04.08.2026. Цены на эти работы установлены в Приложении № 1 к ДС № 1.</w:t>
+        <w:t>Работы на 3, 7–9 этажах выполняются по Договору подряда № СПБ-ГАЗЭ/ОВ/7-9 от 19.06.2026 в редакции Дополнительного соглашения № 1 от 27.07.2026 (далее – ДС № 1). ДС № 1 подписано сторонами через ЭДО «Контур.Диадок» 04.08.2026. Цены на эти работы установлены в Приложении № 1 к ДС № 1.</w:t>
       </w:r>
     </w:p>
     <w:p>
@@ -105,7 +105,7 @@
         <w:rPr>
           <w:b w:val="0"/>
         </w:rPr>
-        <w:t>Часть корректировок мы принимаем, в том числе снижение цен по п. 2.9, 2.10, 2.37, 2.38 до уровня ДС № 1. Однако по ряду позиций просим пересмотреть решение. Ниже — позиции и наши обоснования. Суммы указаны без НДС (Подрядчик применяет УСН).</w:t>
+        <w:t>Часть корректировок мы принимаем, в том числе снижение цен по п. 2.9, 2.10, 2.37, 2.38 до уровня ДС № 1. Однако по ряду позиций просим пересмотреть решение. Ниже – позиции и наши обоснования. Суммы указаны без НДС (Подрядчик применяет УСН).</w:t>
       </w:r>
     </w:p>
     <w:p>
@@ -118,7 +118,7 @@
           <w:b/>
           <w:sz w:val="24"/>
         </w:rPr>
-        <w:t>1. Снижение цен, согласованных в ДС № 1 — 1 495 574,98 ₽</w:t>
+        <w:t>1. Снижение цен, согласованных в ДС № 1 – 1 495 574,98 ₽</w:t>
       </w:r>
     </w:p>
     <w:p>
@@ -387,7 +387,7 @@
                 <w:b w:val="0"/>
                 <w:sz w:val="20"/>
               </w:rPr>
-              <w:t>−1 411 000,00</w:t>
+              <w:t>-1 411 000,00</w:t>
             </w:r>
           </w:p>
         </w:tc>
@@ -504,7 +504,7 @@
                 <w:b w:val="0"/>
                 <w:sz w:val="20"/>
               </w:rPr>
-              <w:t>−84 574,98</w:t>
+              <w:t>-84 574,98</w:t>
             </w:r>
           </w:p>
         </w:tc>
@@ -611,7 +611,7 @@
                 <w:b/>
                 <w:sz w:val="20"/>
               </w:rPr>
-              <w:t>−1 495 574,98</w:t>
+              <w:t>-1 495 574,98</w:t>
             </w:r>
           </w:p>
         </w:tc>
@@ -649,7 +649,7 @@
         <w:rPr>
           <w:b w:val="0"/>
         </w:rPr>
-        <w:t xml:space="preserve"> В комментарии указано «по договору». Но по Договору цена этой работы — 665,89 ₽/м²: и в исходном Приложении № 1 (п. 1.12), и в Приложении № 1 к ДС № 1 (п. 1.33).</w:t>
+        <w:t xml:space="preserve"> В комментарии указано «по договору». Но по Договору цена этой работы – 665,89 ₽/м²: и в исходном Приложении № 1 (п. 1.12), и в Приложении № 1 к ДС № 1 (п. 1.33).</w:t>
       </w:r>
     </w:p>
     <w:p>
@@ -698,7 +698,7 @@
           <w:b/>
           <w:sz w:val="24"/>
         </w:rPr>
-        <w:t>2. Позиции, исключённые без обоснования — 1 151 370 ₽</w:t>
+        <w:t>2. Позиции, исключённые без обоснования – 1 151 370 ₽</w:t>
       </w:r>
     </w:p>
     <w:p>
@@ -1642,7 +1642,7 @@
           <w:b/>
           <w:sz w:val="24"/>
         </w:rPr>
-        <w:t>4. Фанкойлы — 589 160 ₽</w:t>
+        <w:t>4. Фанкойлы – 589 160 ₽</w:t>
       </w:r>
     </w:p>
     <w:p>
@@ -2170,7 +2170,7 @@
         <w:rPr>
           <w:b w:val="0"/>
         </w:rPr>
-        <w:t xml:space="preserve"> Кассетный фанкойл — агрегат с вентилятором, теплообменником и отводом конденсата. Его нужно подвесить, выверить по уровню и по сетке потолка, подключить подачу и обратку через арматуру, подключить дренаж и проверить узел на герметичность.</w:t>
+        <w:t xml:space="preserve"> Кассетный фанкойл – агрегат с вентилятором, теплообменником и отводом конденсата. Его нужно подвесить, выверить по уровню и по сетке потолка, подключить подачу и обратку через арматуру, подключить дренаж и проверить узел на герметичность.</w:t>
       </w:r>
     </w:p>
     <w:p>
@@ -2237,7 +2237,7 @@
           <w:b/>
           <w:sz w:val="24"/>
         </w:rPr>
-        <w:t>5. Изоляция воздуховодов, фасонных изделий и трубопроводов — 781 359 ₽</w:t>
+        <w:t>5. Изоляция воздуховодов, фасонных изделий и трубопроводов – 781 359 ₽</w:t>
       </w:r>
     </w:p>
     <w:p>
@@ -4029,7 +4029,7 @@
         <w:rPr>
           <w:b w:val="0"/>
         </w:rPr>
-        <w:t xml:space="preserve"> Изоляция — тяжёлая ручная работа, которая занимает много времени: раскрой, подгонка по месту, проклейка швов и стыков.</w:t>
+        <w:t xml:space="preserve"> Изоляция – тяжёлая ручная работа, которая занимает много времени: раскрой, подгонка по месту, проклейка швов и стыков.</w:t>
       </w:r>
     </w:p>
     <w:p>
@@ -4041,7 +4041,7 @@
         <w:rPr>
           <w:b/>
         </w:rPr>
-        <w:t>Изделия — за штуку, а не за м².</w:t>
+        <w:t>Изделия – за штуку, а не за м².</w:t>
       </w:r>
       <w:r>
         <w:rPr>
@@ -4150,7 +4150,7 @@
           <w:b/>
           <w:sz w:val="24"/>
         </w:rPr>
-        <w:t>6. Дополнительные работы на 3, 7–9 этажах — 204 800 ₽</w:t>
+        <w:t>6. Дополнительные работы на 3, 7–9 этажах – 204 800 ₽</w:t>
       </w:r>
     </w:p>
     <w:p>
@@ -4898,7 +4898,7 @@
         <w:rPr>
           <w:b w:val="0"/>
         </w:rPr>
-        <w:t xml:space="preserve"> Это две операции: демонтаж диффузора из смонтированного потолка и повторный монтаж с подключением и регулировкой. Предложенные 4 800 ₽ — это фактически цена одного монтажа щелевой решётки (4 000 ₽, п. 1.4 Приложения № 1 к ДС № 1), без демонтажа и работы в готовом потолке.</w:t>
+        <w:t xml:space="preserve"> Это две операции: демонтаж диффузора из смонтированного потолка и повторный монтаж с подключением и регулировкой. Предложенные 4 800 ₽ – это фактически цена одного монтажа щелевой решётки (4 000 ₽, п. 1.4 Приложения № 1 к ДС № 1), без демонтажа и работы в готовом потолке.</w:t>
       </w:r>
     </w:p>
     <w:p>
@@ -4934,7 +4934,7 @@
         <w:rPr>
           <w:b w:val="0"/>
         </w:rPr>
-        <w:t xml:space="preserve"> Три операции в два приёма: демонтаж существующего диффузора, временная гибкая подводка, а после зашивки потолка — повторный монтаж диффузора в ГКЛ.</w:t>
+        <w:t xml:space="preserve"> Три операции в два приёма: демонтаж существующего диффузора, временная гибкая подводка, а после зашивки потолка – повторный монтаж диффузора в ГКЛ.</w:t>
       </w:r>
     </w:p>
     <w:p>
@@ -4983,7 +4983,7 @@
           <w:b/>
           <w:sz w:val="24"/>
         </w:rPr>
-        <w:t>7. Новые работы: цены ниже договорных на те же изделия — 94 031,18 ₽</w:t>
+        <w:t>7. Новые работы: цены ниже договорных на те же изделия – 94 031,18 ₽</w:t>
       </w:r>
     </w:p>
     <w:p>
@@ -4995,7 +4995,7 @@
         <w:rPr>
           <w:b w:val="0"/>
         </w:rPr>
-        <w:t>Работы на 10 и 2 этажах — новые, в Договоре их нет. Однако по этим позициям Вы ссылаетесь на договор, а предлагаете цену ниже договорной на то же изделие или ниже Вашей же цены на такую же работу в другом разделе КП. Просим привести расценки к единому уровню.</w:t>
+        <w:t>Работы на 10 и 2 этажах – новые, в Договоре их нет. Однако по этим позициям Вы ссылаетесь на договор, а предлагаете цену ниже договорной на то же изделие или ниже Вашей же цены на такую же работу в другом разделе КП. Просим привести расценки к единому уровню.</w:t>
       </w:r>
     </w:p>
     <w:p>
@@ -5098,7 +5098,7 @@
           <w:b/>
           <w:sz w:val="24"/>
         </w:rPr>
-        <w:t>8. Дымоудаление — 1 028 480 ₽ в отдельное допсоглашение</w:t>
+        <w:t>8. Дымоудаление – 1 028 480 ₽ в отдельное допсоглашение</w:t>
       </w:r>
     </w:p>
     <w:p>
@@ -5154,7 +5154,7 @@
         <w:rPr>
           <w:b w:val="0"/>
         </w:rPr>
-        <w:t>Просим вернуть в КП 4 316 295,16 ₽ по разделам 1, 2 и 4–7, из них 1 495 574,98 ₽ — цены, уже подписанные в ДС № 1. Ещё 1 028 480 ₽ по дымоудалению уходят в отдельное допсоглашение.</w:t>
+        <w:t>Просим вернуть в КП 4 316 295,16 ₽ по разделам 1, 2 и 4–7, из них 1 495 574,98 ₽ – цены, уже подписанные в ДС № 1. Ещё 1 028 480 ₽ по дымоудалению уходят в отдельное допсоглашение.</w:t>
       </w:r>
     </w:p>
     <w:tbl>
@@ -6436,13 +6436,13 @@
         <w:rPr>
           <w:b/>
         </w:rPr>
-        <w:t>Итоговая стоимость работ с учётом наших возражений — 20 390 492,30 ₽</w:t>
+        <w:t>Итоговая стоимость работ с учётом наших возражений – 20 390 492,30 ₽</w:t>
       </w:r>
       <w:r>
         <w:rPr>
           <w:b w:val="0"/>
         </w:rPr>
-        <w:t>, с дымоудалением — 21 418 972,30 ₽.</w:t>
+        <w:t>, с дымоудалением – 21 418 972,30 ₽.</w:t>
       </w:r>
     </w:p>
     <w:tbl>
@@ -6562,7 +6562,7 @@
                 <w:b w:val="0"/>
                 <w:sz w:val="20"/>
               </w:rPr>
-              <w:t>Новые работы (10 и 2 этажи, дополнительные работы) — в ДС № 2</w:t>
+              <w:t>Новые работы (10 и 2 этажи, дополнительные работы) – в ДС № 2</w:t>
             </w:r>
           </w:p>
         </w:tc>
@@ -6646,7 +6646,7 @@
                 <w:b w:val="0"/>
                 <w:sz w:val="20"/>
               </w:rPr>
-              <w:t>Дымоудаление (10 и 2 этажи) — отдельное допсоглашение</w:t>
+              <w:t>Дымоудаление (10 и 2 этажи) – отдельное допсоглашение</w:t>
             </w:r>
           </w:p>
         </w:tc>
@@ -6725,7 +6725,7 @@
         <w:rPr>
           <w:b w:val="0"/>
         </w:rPr>
-        <w:t>Для сравнения: Ваша редакция КП с учётом всех комментариев — 16 074 197,14 ₽, разница — 4 316 295,16 ₽. Исходное КП — 22 665 254,14 ₽.</w:t>
+        <w:t>Для сравнения: Ваша редакция КП с учётом всех комментариев – 16 074 197,14 ₽, разница – 4 316 295,16 ₽. Исходное КП – 22 665 254,14 ₽.</w:t>
       </w:r>
     </w:p>
     <w:p>
@@ -6738,7 +6738,7 @@
         <w:rPr>
           <w:b w:val="0"/>
         </w:rPr>
-        <w:t>Просим рассмотреть возражения и направить ответ до «___» __________ 2026 г. После согласования мы подготовим итоговую редакцию КП. Работы на 10 и 2 этажах и дополнительные работы предлагаем оформить Дополнительным соглашением № 2 к Договору. Если удобнее обсудить позиции на встрече, готовы подъехать в любой рабочий день.</w:t>
+        <w:t>Просим рассмотреть возражения и направить ответ. После согласования мы подготовим итоговую редакцию КП. Работы на 10 и 2 этажах и дополнительные работы предлагаем оформить Дополнительным соглашением № 2 к Договору. Если удобнее обсудить позиции на встрече, готовы подъехать в любой рабочий день.</w:t>
       </w:r>
     </w:p>
     <w:p>

</xml_diff>